<commit_message>
Expand IJMR manuscript packages for India surveillance
</commit_message>
<xml_diff>
--- a/projects/india_patient_safety_surveillance/docs/manuscripts/target_journal_packages/ijmr_special_article_surveillance/manuscript_ijmr_special_article_surveillance.docx
+++ b/projects/india_patient_safety_surveillance/docs/manuscripts/target_journal_packages/ijmr_special_article_surveillance/manuscript_ijmr_special_article_surveillance.docx
@@ -740,6 +740,345 @@
     <w:p>
       <w:pPr>
         <w:pStyle w:val="FirstParagraph"/>
+      </w:pPr>
+      <w:r>
+        <w:t xml:space="preserve">Table 1 summarizes the minimum design requirements that convert a reporting portal into a national surveillance and learning system rather than a passive incident repository.</w:t>
+      </w:r>
+    </w:p>
+    <w:tbl>
+      <w:tblPr>
+        <w:tblStyle w:val="Table"/>
+        <w:tblW w:type="pct" w:w="5000"/>
+        <w:tblLayout w:type="fixed"/>
+        <w:tblLook w:firstRow="1" w:lastRow="0" w:firstColumn="0" w:lastColumn="0" w:noHBand="0" w:noVBand="0" w:val="0020"/>
+      </w:tblPr>
+      <w:tblGrid>
+        <w:gridCol w:w="2640"/>
+        <w:gridCol w:w="2640"/>
+        <w:gridCol w:w="2640"/>
+      </w:tblGrid>
+      <w:tr>
+        <w:trPr>
+          <w:tblHeader w:val="on"/>
+        </w:trPr>
+        <w:tc>
+          <w:tcPr/>
+          <w:p>
+            <w:pPr>
+              <w:pStyle w:val="Compact"/>
+            </w:pPr>
+            <w:r>
+              <w:t xml:space="preserve">Design layer</w:t>
+            </w:r>
+          </w:p>
+        </w:tc>
+        <w:tc>
+          <w:tcPr/>
+          <w:p>
+            <w:pPr>
+              <w:pStyle w:val="Compact"/>
+            </w:pPr>
+            <w:r>
+              <w:t xml:space="preserve">Minimum national requirement</w:t>
+            </w:r>
+          </w:p>
+        </w:tc>
+        <w:tc>
+          <w:tcPr/>
+          <w:p>
+            <w:pPr>
+              <w:pStyle w:val="Compact"/>
+            </w:pPr>
+            <w:r>
+              <w:t xml:space="preserve">Operational rationale</w:t>
+            </w:r>
+          </w:p>
+        </w:tc>
+      </w:tr>
+      <w:tr>
+        <w:tc>
+          <w:tcPr/>
+          <w:p>
+            <w:pPr>
+              <w:pStyle w:val="Compact"/>
+            </w:pPr>
+            <w:r>
+              <w:t xml:space="preserve">Intake and reporting</w:t>
+            </w:r>
+          </w:p>
+        </w:tc>
+        <w:tc>
+          <w:tcPr/>
+          <w:p>
+            <w:pPr>
+              <w:pStyle w:val="Compact"/>
+            </w:pPr>
+            <w:r>
+              <w:t xml:space="preserve">Separate daily burden surveillance from event-level case reporting</w:t>
+            </w:r>
+          </w:p>
+        </w:tc>
+        <w:tc>
+          <w:tcPr/>
+          <w:p>
+            <w:pPr>
+              <w:pStyle w:val="Compact"/>
+            </w:pPr>
+            <w:r>
+              <w:t xml:space="preserve">Preserves routine monitoring while allowing deeper investigation</w:t>
+            </w:r>
+          </w:p>
+        </w:tc>
+      </w:tr>
+      <w:tr>
+        <w:tc>
+          <w:tcPr/>
+          <w:p>
+            <w:pPr>
+              <w:pStyle w:val="Compact"/>
+            </w:pPr>
+            <w:r>
+              <w:t xml:space="preserve">Taxonomy and classification</w:t>
+            </w:r>
+          </w:p>
+        </w:tc>
+        <w:tc>
+          <w:tcPr/>
+          <w:p>
+            <w:pPr>
+              <w:pStyle w:val="Compact"/>
+            </w:pPr>
+            <w:r>
+              <w:t xml:space="preserve">Use a canonical safety taxonomy across facilities and states</w:t>
+            </w:r>
+          </w:p>
+        </w:tc>
+        <w:tc>
+          <w:tcPr/>
+          <w:p>
+            <w:pPr>
+              <w:pStyle w:val="Compact"/>
+            </w:pPr>
+            <w:r>
+              <w:t xml:space="preserve">Enables comparability, aggregation, and benchmarking</w:t>
+            </w:r>
+          </w:p>
+        </w:tc>
+      </w:tr>
+      <w:tr>
+        <w:tc>
+          <w:tcPr/>
+          <w:p>
+            <w:pPr>
+              <w:pStyle w:val="Compact"/>
+            </w:pPr>
+            <w:r>
+              <w:t xml:space="preserve">Denominators and context</w:t>
+            </w:r>
+          </w:p>
+        </w:tc>
+        <w:tc>
+          <w:tcPr/>
+          <w:p>
+            <w:pPr>
+              <w:pStyle w:val="Compact"/>
+            </w:pPr>
+            <w:r>
+              <w:t xml:space="preserve">Capture patient-load and operational strain data</w:t>
+            </w:r>
+          </w:p>
+        </w:tc>
+        <w:tc>
+          <w:tcPr/>
+          <w:p>
+            <w:pPr>
+              <w:pStyle w:val="Compact"/>
+            </w:pPr>
+            <w:r>
+              <w:t xml:space="preserve">Supports interpretable rates and threshold setting</w:t>
+            </w:r>
+          </w:p>
+        </w:tc>
+      </w:tr>
+      <w:tr>
+        <w:tc>
+          <w:tcPr/>
+          <w:p>
+            <w:pPr>
+              <w:pStyle w:val="Compact"/>
+            </w:pPr>
+            <w:r>
+              <w:t xml:space="preserve">Review workflow</w:t>
+            </w:r>
+          </w:p>
+        </w:tc>
+        <w:tc>
+          <w:tcPr/>
+          <w:p>
+            <w:pPr>
+              <w:pStyle w:val="Compact"/>
+            </w:pPr>
+            <w:r>
+              <w:t xml:space="preserve">Define facility, state, and national review responsibilities</w:t>
+            </w:r>
+          </w:p>
+        </w:tc>
+        <w:tc>
+          <w:tcPr/>
+          <w:p>
+            <w:pPr>
+              <w:pStyle w:val="Compact"/>
+            </w:pPr>
+            <w:r>
+              <w:t xml:space="preserve">Prevents unowned reports and weak closure loops</w:t>
+            </w:r>
+          </w:p>
+        </w:tc>
+      </w:tr>
+      <w:tr>
+        <w:tc>
+          <w:tcPr/>
+          <w:p>
+            <w:pPr>
+              <w:pStyle w:val="Compact"/>
+            </w:pPr>
+            <w:r>
+              <w:t xml:space="preserve">Signal detection</w:t>
+            </w:r>
+          </w:p>
+        </w:tc>
+        <w:tc>
+          <w:tcPr/>
+          <w:p>
+            <w:pPr>
+              <w:pStyle w:val="Compact"/>
+            </w:pPr>
+            <w:r>
+              <w:t xml:space="preserve">Support threshold-based and pattern-based escalation</w:t>
+            </w:r>
+          </w:p>
+        </w:tc>
+        <w:tc>
+          <w:tcPr/>
+          <w:p>
+            <w:pPr>
+              <w:pStyle w:val="Compact"/>
+            </w:pPr>
+            <w:r>
+              <w:t xml:space="preserve">Improves early recognition of recurrent or severe risks</w:t>
+            </w:r>
+          </w:p>
+        </w:tc>
+      </w:tr>
+      <w:tr>
+        <w:tc>
+          <w:tcPr/>
+          <w:p>
+            <w:pPr>
+              <w:pStyle w:val="Compact"/>
+            </w:pPr>
+            <w:r>
+              <w:t xml:space="preserve">Governance and audit</w:t>
+            </w:r>
+          </w:p>
+        </w:tc>
+        <w:tc>
+          <w:tcPr/>
+          <w:p>
+            <w:pPr>
+              <w:pStyle w:val="Compact"/>
+            </w:pPr>
+            <w:r>
+              <w:t xml:space="preserve">Preserve traceability, CAPA, and policy feedback</w:t>
+            </w:r>
+          </w:p>
+        </w:tc>
+        <w:tc>
+          <w:tcPr/>
+          <w:p>
+            <w:pPr>
+              <w:pStyle w:val="Compact"/>
+            </w:pPr>
+            <w:r>
+              <w:t xml:space="preserve">Converts reporting into visible learning and prevention</w:t>
+            </w:r>
+          </w:p>
+        </w:tc>
+      </w:tr>
+      <w:tr>
+        <w:tc>
+          <w:tcPr/>
+          <w:p>
+            <w:pPr>
+              <w:pStyle w:val="Compact"/>
+            </w:pPr>
+            <w:r>
+              <w:t xml:space="preserve">Interoperability</w:t>
+            </w:r>
+          </w:p>
+        </w:tc>
+        <w:tc>
+          <w:tcPr/>
+          <w:p>
+            <w:pPr>
+              <w:pStyle w:val="Compact"/>
+            </w:pPr>
+            <w:r>
+              <w:t xml:space="preserve">Align with registries and API-based exchange</w:t>
+            </w:r>
+          </w:p>
+        </w:tc>
+        <w:tc>
+          <w:tcPr/>
+          <w:p>
+            <w:pPr>
+              <w:pStyle w:val="Compact"/>
+            </w:pPr>
+            <w:r>
+              <w:t xml:space="preserve">Reduces siloing and allows future digital integration</w:t>
+            </w:r>
+          </w:p>
+        </w:tc>
+      </w:tr>
+      <w:tr>
+        <w:tc>
+          <w:tcPr/>
+          <w:p>
+            <w:pPr>
+              <w:pStyle w:val="Compact"/>
+            </w:pPr>
+            <w:r>
+              <w:t xml:space="preserve">AI assistance</w:t>
+            </w:r>
+          </w:p>
+        </w:tc>
+        <w:tc>
+          <w:tcPr/>
+          <w:p>
+            <w:pPr>
+              <w:pStyle w:val="Compact"/>
+            </w:pPr>
+            <w:r>
+              <w:t xml:space="preserve">Restrict AI to bounded assistive functions under human oversight</w:t>
+            </w:r>
+          </w:p>
+        </w:tc>
+        <w:tc>
+          <w:tcPr/>
+          <w:p>
+            <w:pPr>
+              <w:pStyle w:val="Compact"/>
+            </w:pPr>
+            <w:r>
+              <w:t xml:space="preserve">Improves structuring and prioritization without replacing accountability</w:t>
+            </w:r>
+          </w:p>
+        </w:tc>
+      </w:tr>
+    </w:tbl>
+    <w:p>
+      <w:pPr>
+        <w:pStyle w:val="BodyText"/>
       </w:pPr>
       <w:r>
         <w:t xml:space="preserve">The surveillance system should include durable audit trails, policy linkage, role-aware permissions, and documented closure logic. Governance is not an add-on; it is what distinguishes learning from passive reporting. Policy versions, escalations, and CAPA records should be queryable and reviewable.</w:t>

</xml_diff>

<commit_message>
Align IJMR round1 package with author guideline structure
</commit_message>
<xml_diff>
--- a/projects/india_patient_safety_surveillance/docs/manuscripts/target_journal_packages/ijmr_special_article_surveillance/manuscript_ijmr_special_article_surveillance.docx
+++ b/projects/india_patient_safety_surveillance/docs/manuscripts/target_journal_packages/ijmr_special_article_surveillance/manuscript_ijmr_special_article_surveillance.docx
@@ -2,7 +2,7 @@
 <file path=word/document.xml><?xml version="1.0" encoding="utf-8"?>
 <w:document xmlns:w="http://schemas.openxmlformats.org/wordprocessingml/2006/main" xmlns:m="http://schemas.openxmlformats.org/officeDocument/2006/math" xmlns:r="http://schemas.openxmlformats.org/officeDocument/2006/relationships" xmlns:o="urn:schemas-microsoft-com:office:office" xmlns:v="urn:schemas-microsoft-com:vml" xmlns:w10="urn:schemas-microsoft-com:office:word" xmlns:a="http://schemas.openxmlformats.org/drawingml/2006/main" xmlns:pic="http://schemas.openxmlformats.org/drawingml/2006/picture" xmlns:wp="http://schemas.openxmlformats.org/drawingml/2006/wordprocessingDrawing">
   <w:body>
-    <w:bookmarkStart w:id="46" w:name="X00802b96b1a32253dca06befba5ed2f8b2af367"/>
+    <w:bookmarkStart w:id="50" w:name="X00802b96b1a32253dca06befba5ed2f8b2af367"/>
     <w:p>
       <w:pPr>
         <w:pStyle w:val="Heading1"/>
@@ -784,7 +784,1217 @@
         <w:pStyle w:val="FirstParagraph"/>
       </w:pPr>
       <w:r>
-        <w:t xml:space="preserve">Table 1 summarizes the minimum design requirements that convert a reporting portal into a national surveillance and learning system rather than a passive incident repository.</w:t>
+        <w:t xml:space="preserve">Table I summarizes the minimum design requirements that convert a reporting portal into a national surveillance and learning system rather than a passive incident repository.</w:t>
+      </w:r>
+    </w:p>
+    <w:p>
+      <w:pPr>
+        <w:pStyle w:val="BodyText"/>
+      </w:pPr>
+      <w:r>
+        <w:t xml:space="preserve">The surveillance system should include durable audit trails, policy linkage, role-aware permissions, and documented closure logic. Governance is not an add-on; it is what distinguishes learning from passive reporting. Policy versions, escalations, and CAPA records should be queryable and reviewable.</w:t>
+      </w:r>
+    </w:p>
+    <w:bookmarkEnd w:id="21"/>
+    <w:bookmarkEnd w:id="22"/>
+    <w:bookmarkStart w:id="26" w:name="digital-integration-requirements"/>
+    <w:p>
+      <w:pPr>
+        <w:pStyle w:val="Heading2"/>
+      </w:pPr>
+      <w:r>
+        <w:t xml:space="preserve">Digital integration requirements</w:t>
+      </w:r>
+    </w:p>
+    <w:p>
+      <w:pPr>
+        <w:pStyle w:val="FirstParagraph"/>
+      </w:pPr>
+      <w:r>
+        <w:t xml:space="preserve">India’s future patient safety surveillance system should be interoperable rather than monolithic.</w:t>
+      </w:r>
+    </w:p>
+    <w:bookmarkStart w:id="23" w:name="abdm-aligned-readiness"/>
+    <w:p>
+      <w:pPr>
+        <w:pStyle w:val="Heading3"/>
+      </w:pPr>
+      <w:r>
+        <w:t xml:space="preserve">ABDM-aligned readiness</w:t>
+      </w:r>
+    </w:p>
+    <w:p>
+      <w:pPr>
+        <w:pStyle w:val="FirstParagraph"/>
+      </w:pPr>
+      <w:r>
+        <w:t xml:space="preserve">ABDM provides a relevant enabling direction through digital identity, registries, and interoperability-oriented infrastructure.</w:t>
+      </w:r>
+      <w:r>
+        <w:t xml:space="preserve">3,4</w:t>
+      </w:r>
+      <w:r>
+        <w:t xml:space="preserve"> </w:t>
+      </w:r>
+      <w:r>
+        <w:t xml:space="preserve">A patient safety surveillance platform should be able to use these assets without being dependent on them for all workflows. Facility, department, and provider identities should be mappable to standardized registries where available.</w:t>
+      </w:r>
+    </w:p>
+    <w:bookmarkEnd w:id="23"/>
+    <w:bookmarkStart w:id="24" w:name="manual-plus-digital-ingestion"/>
+    <w:p>
+      <w:pPr>
+        <w:pStyle w:val="Heading3"/>
+      </w:pPr>
+      <w:r>
+        <w:t xml:space="preserve">Manual-plus-digital ingestion</w:t>
+      </w:r>
+    </w:p>
+    <w:p>
+      <w:pPr>
+        <w:pStyle w:val="FirstParagraph"/>
+      </w:pPr>
+      <w:r>
+        <w:t xml:space="preserve">The system should accept more than one input mode:</w:t>
+      </w:r>
+    </w:p>
+    <w:p>
+      <w:pPr>
+        <w:pStyle w:val="Compact"/>
+        <w:numPr>
+          <w:ilvl w:val="0"/>
+          <w:numId w:val="1007"/>
+        </w:numPr>
+      </w:pPr>
+      <w:r>
+        <w:t xml:space="preserve">manual department submissions</w:t>
+      </w:r>
+    </w:p>
+    <w:p>
+      <w:pPr>
+        <w:pStyle w:val="Compact"/>
+        <w:numPr>
+          <w:ilvl w:val="0"/>
+          <w:numId w:val="1007"/>
+        </w:numPr>
+      </w:pPr>
+      <w:r>
+        <w:t xml:space="preserve">manually entered event cases</w:t>
+      </w:r>
+    </w:p>
+    <w:p>
+      <w:pPr>
+        <w:pStyle w:val="Compact"/>
+        <w:numPr>
+          <w:ilvl w:val="0"/>
+          <w:numId w:val="1007"/>
+        </w:numPr>
+      </w:pPr>
+      <w:r>
+        <w:t xml:space="preserve">imported digital events from hospital systems</w:t>
+      </w:r>
+    </w:p>
+    <w:p>
+      <w:pPr>
+        <w:pStyle w:val="Compact"/>
+        <w:numPr>
+          <w:ilvl w:val="0"/>
+          <w:numId w:val="1007"/>
+        </w:numPr>
+      </w:pPr>
+      <w:r>
+        <w:t xml:space="preserve">machine-detected cases or signals from prospective safety tools such as SentinelCare</w:t>
+      </w:r>
+    </w:p>
+    <w:p>
+      <w:pPr>
+        <w:pStyle w:val="FirstParagraph"/>
+      </w:pPr>
+      <w:r>
+        <w:t xml:space="preserve">This is important because many Indian facilities will initially operate in mixed digital maturity states. A surveillance system that only works with fully digital institutions will exclude much of the real care ecosystem; one that only supports manual entry will not scale well for digital hospitals.</w:t>
+      </w:r>
+    </w:p>
+    <w:bookmarkEnd w:id="24"/>
+    <w:bookmarkStart w:id="25" w:name="data-protection-and-minimality"/>
+    <w:p>
+      <w:pPr>
+        <w:pStyle w:val="Heading3"/>
+      </w:pPr>
+      <w:r>
+        <w:t xml:space="preserve">Data protection and minimality</w:t>
+      </w:r>
+    </w:p>
+    <w:p>
+      <w:pPr>
+        <w:pStyle w:val="FirstParagraph"/>
+      </w:pPr>
+      <w:r>
+        <w:t xml:space="preserve">Not every signal requires identifiable patient detail at higher levels. Facility-level investigation may require identifiable information, but state and national learning layers should preferentially use minimized, structured, role-appropriate records. This protects confidentiality while preserving learning utility.</w:t>
+      </w:r>
+    </w:p>
+    <w:bookmarkEnd w:id="25"/>
+    <w:bookmarkEnd w:id="26"/>
+    <w:bookmarkStart w:id="30" w:name="where-ai-can-and-cannot-help"/>
+    <w:p>
+      <w:pPr>
+        <w:pStyle w:val="Heading2"/>
+      </w:pPr>
+      <w:r>
+        <w:t xml:space="preserve">Where AI can and cannot help</w:t>
+      </w:r>
+    </w:p>
+    <w:p>
+      <w:pPr>
+        <w:pStyle w:val="FirstParagraph"/>
+      </w:pPr>
+      <w:r>
+        <w:t xml:space="preserve">There is growing interest in applying AI to safety reporting and classification. However, a national patient safety surveillance system should use AI cautiously and transparently.</w:t>
+      </w:r>
+    </w:p>
+    <w:bookmarkStart w:id="27" w:name="appropriate-uses"/>
+    <w:p>
+      <w:pPr>
+        <w:pStyle w:val="Heading3"/>
+      </w:pPr>
+      <w:r>
+        <w:t xml:space="preserve">Appropriate uses</w:t>
+      </w:r>
+    </w:p>
+    <w:p>
+      <w:pPr>
+        <w:pStyle w:val="FirstParagraph"/>
+      </w:pPr>
+      <w:r>
+        <w:t xml:space="preserve">AI can be helpful in bounded tasks such as:</w:t>
+      </w:r>
+    </w:p>
+    <w:p>
+      <w:pPr>
+        <w:pStyle w:val="Compact"/>
+        <w:numPr>
+          <w:ilvl w:val="0"/>
+          <w:numId w:val="1008"/>
+        </w:numPr>
+      </w:pPr>
+      <w:r>
+        <w:t xml:space="preserve">converting free-text narratives into structured candidate fields;</w:t>
+      </w:r>
+    </w:p>
+    <w:p>
+      <w:pPr>
+        <w:pStyle w:val="Compact"/>
+        <w:numPr>
+          <w:ilvl w:val="0"/>
+          <w:numId w:val="1008"/>
+        </w:numPr>
+      </w:pPr>
+      <w:r>
+        <w:t xml:space="preserve">suggesting domain and deviation classes;</w:t>
+      </w:r>
+    </w:p>
+    <w:p>
+      <w:pPr>
+        <w:pStyle w:val="Compact"/>
+        <w:numPr>
+          <w:ilvl w:val="0"/>
+          <w:numId w:val="1008"/>
+        </w:numPr>
+      </w:pPr>
+      <w:r>
+        <w:t xml:space="preserve">clustering similar incidents across facilities;</w:t>
+      </w:r>
+    </w:p>
+    <w:p>
+      <w:pPr>
+        <w:pStyle w:val="Compact"/>
+        <w:numPr>
+          <w:ilvl w:val="0"/>
+          <w:numId w:val="1008"/>
+        </w:numPr>
+      </w:pPr>
+      <w:r>
+        <w:t xml:space="preserve">drafting concise summaries for reviewers;</w:t>
+      </w:r>
+    </w:p>
+    <w:p>
+      <w:pPr>
+        <w:pStyle w:val="Compact"/>
+        <w:numPr>
+          <w:ilvl w:val="0"/>
+          <w:numId w:val="1008"/>
+        </w:numPr>
+      </w:pPr>
+      <w:r>
+        <w:t xml:space="preserve">surfacing missing information for investigation;</w:t>
+      </w:r>
+    </w:p>
+    <w:p>
+      <w:pPr>
+        <w:pStyle w:val="Compact"/>
+        <w:numPr>
+          <w:ilvl w:val="0"/>
+          <w:numId w:val="1008"/>
+        </w:numPr>
+      </w:pPr>
+      <w:r>
+        <w:t xml:space="preserve">supporting trend interpretation and bulletin drafting.</w:t>
+      </w:r>
+    </w:p>
+    <w:p>
+      <w:pPr>
+        <w:pStyle w:val="FirstParagraph"/>
+      </w:pPr>
+      <w:r>
+        <w:t xml:space="preserve">These uses reduce review burden and improve consistency without displacing human authority.</w:t>
+      </w:r>
+    </w:p>
+    <w:bookmarkEnd w:id="27"/>
+    <w:bookmarkStart w:id="28" w:name="inappropriate-uses"/>
+    <w:p>
+      <w:pPr>
+        <w:pStyle w:val="Heading3"/>
+      </w:pPr>
+      <w:r>
+        <w:t xml:space="preserve">Inappropriate uses</w:t>
+      </w:r>
+    </w:p>
+    <w:p>
+      <w:pPr>
+        <w:pStyle w:val="FirstParagraph"/>
+      </w:pPr>
+      <w:r>
+        <w:t xml:space="preserve">AI should not autonomously:</w:t>
+      </w:r>
+    </w:p>
+    <w:p>
+      <w:pPr>
+        <w:pStyle w:val="Compact"/>
+        <w:numPr>
+          <w:ilvl w:val="0"/>
+          <w:numId w:val="1009"/>
+        </w:numPr>
+      </w:pPr>
+      <w:r>
+        <w:t xml:space="preserve">determine final severity in serious cases;</w:t>
+      </w:r>
+    </w:p>
+    <w:p>
+      <w:pPr>
+        <w:pStyle w:val="Compact"/>
+        <w:numPr>
+          <w:ilvl w:val="0"/>
+          <w:numId w:val="1009"/>
+        </w:numPr>
+      </w:pPr>
+      <w:r>
+        <w:t xml:space="preserve">assign blame or punitive consequence;</w:t>
+      </w:r>
+    </w:p>
+    <w:p>
+      <w:pPr>
+        <w:pStyle w:val="Compact"/>
+        <w:numPr>
+          <w:ilvl w:val="0"/>
+          <w:numId w:val="1009"/>
+        </w:numPr>
+      </w:pPr>
+      <w:r>
+        <w:t xml:space="preserve">close serious cases;</w:t>
+      </w:r>
+    </w:p>
+    <w:p>
+      <w:pPr>
+        <w:pStyle w:val="Compact"/>
+        <w:numPr>
+          <w:ilvl w:val="0"/>
+          <w:numId w:val="1009"/>
+        </w:numPr>
+      </w:pPr>
+      <w:r>
+        <w:t xml:space="preserve">replace governance review;</w:t>
+      </w:r>
+    </w:p>
+    <w:p>
+      <w:pPr>
+        <w:pStyle w:val="Compact"/>
+        <w:numPr>
+          <w:ilvl w:val="0"/>
+          <w:numId w:val="1009"/>
+        </w:numPr>
+      </w:pPr>
+      <w:r>
+        <w:t xml:space="preserve">make unsupported claims about causality.</w:t>
+      </w:r>
+    </w:p>
+    <w:p>
+      <w:pPr>
+        <w:pStyle w:val="FirstParagraph"/>
+      </w:pPr>
+      <w:r>
+        <w:t xml:space="preserve">The WHO and broader health AI governance literature emphasize the need for transparency, accountability, human oversight, and fitness for purpose.</w:t>
+      </w:r>
+      <w:r>
+        <w:t xml:space="preserve">2,9</w:t>
+      </w:r>
+      <w:r>
+        <w:t xml:space="preserve"> </w:t>
+      </w:r>
+      <w:r>
+        <w:t xml:space="preserve">In the Indian context, these principles are especially important because patient safety systems must build trust, not deepen opacity.</w:t>
+      </w:r>
+    </w:p>
+    <w:bookmarkEnd w:id="28"/>
+    <w:bookmarkStart w:id="29" w:name="governance-requirements-for-ai"/>
+    <w:p>
+      <w:pPr>
+        <w:pStyle w:val="Heading3"/>
+      </w:pPr>
+      <w:r>
+        <w:t xml:space="preserve">Governance requirements for AI</w:t>
+      </w:r>
+    </w:p>
+    <w:p>
+      <w:pPr>
+        <w:pStyle w:val="FirstParagraph"/>
+      </w:pPr>
+      <w:r>
+        <w:t xml:space="preserve">An AI-enabled patient safety system should document:</w:t>
+      </w:r>
+    </w:p>
+    <w:p>
+      <w:pPr>
+        <w:pStyle w:val="Compact"/>
+        <w:numPr>
+          <w:ilvl w:val="0"/>
+          <w:numId w:val="1010"/>
+        </w:numPr>
+      </w:pPr>
+      <w:r>
+        <w:t xml:space="preserve">provider and model used;</w:t>
+      </w:r>
+    </w:p>
+    <w:p>
+      <w:pPr>
+        <w:pStyle w:val="Compact"/>
+        <w:numPr>
+          <w:ilvl w:val="0"/>
+          <w:numId w:val="1010"/>
+        </w:numPr>
+      </w:pPr>
+      <w:r>
+        <w:t xml:space="preserve">task purpose;</w:t>
+      </w:r>
+    </w:p>
+    <w:p>
+      <w:pPr>
+        <w:pStyle w:val="Compact"/>
+        <w:numPr>
+          <w:ilvl w:val="0"/>
+          <w:numId w:val="1010"/>
+        </w:numPr>
+      </w:pPr>
+      <w:r>
+        <w:t xml:space="preserve">human reviewer override;</w:t>
+      </w:r>
+    </w:p>
+    <w:p>
+      <w:pPr>
+        <w:pStyle w:val="Compact"/>
+        <w:numPr>
+          <w:ilvl w:val="0"/>
+          <w:numId w:val="1010"/>
+        </w:numPr>
+      </w:pPr>
+      <w:r>
+        <w:t xml:space="preserve">confidence or uncertainty marker where appropriate;</w:t>
+      </w:r>
+    </w:p>
+    <w:p>
+      <w:pPr>
+        <w:pStyle w:val="Compact"/>
+        <w:numPr>
+          <w:ilvl w:val="0"/>
+          <w:numId w:val="1010"/>
+        </w:numPr>
+      </w:pPr>
+      <w:r>
+        <w:t xml:space="preserve">audit trail of AI-assisted outputs.</w:t>
+      </w:r>
+    </w:p>
+    <w:p>
+      <w:pPr>
+        <w:pStyle w:val="FirstParagraph"/>
+      </w:pPr>
+      <w:r>
+        <w:t xml:space="preserve">In other words, AI should function as an assistive layer within governance, not as the governance mechanism itself.</w:t>
+      </w:r>
+    </w:p>
+    <w:bookmarkEnd w:id="29"/>
+    <w:bookmarkEnd w:id="30"/>
+    <w:bookmarkStart w:id="34" w:name="implementation-priorities-for-india"/>
+    <w:p>
+      <w:pPr>
+        <w:pStyle w:val="Heading2"/>
+      </w:pPr>
+      <w:r>
+        <w:t xml:space="preserve">Implementation priorities for India</w:t>
+      </w:r>
+    </w:p>
+    <w:p>
+      <w:pPr>
+        <w:pStyle w:val="FirstParagraph"/>
+      </w:pPr>
+      <w:r>
+        <w:t xml:space="preserve">A realistic national rollout should proceed in stages.</w:t>
+      </w:r>
+    </w:p>
+    <w:bookmarkStart w:id="31" w:name="stage-1-facility-and-state-pilot"/>
+    <w:p>
+      <w:pPr>
+        <w:pStyle w:val="Heading3"/>
+      </w:pPr>
+      <w:r>
+        <w:t xml:space="preserve">Stage 1: facility and state pilot</w:t>
+      </w:r>
+    </w:p>
+    <w:p>
+      <w:pPr>
+        <w:pStyle w:val="FirstParagraph"/>
+      </w:pPr>
+      <w:r>
+        <w:t xml:space="preserve">Initial pilots should focus on:</w:t>
+      </w:r>
+    </w:p>
+    <w:p>
+      <w:pPr>
+        <w:pStyle w:val="Compact"/>
+        <w:numPr>
+          <w:ilvl w:val="0"/>
+          <w:numId w:val="1011"/>
+        </w:numPr>
+      </w:pPr>
+      <w:r>
+        <w:t xml:space="preserve">a minimum daily surveillance dataset;</w:t>
+      </w:r>
+    </w:p>
+    <w:p>
+      <w:pPr>
+        <w:pStyle w:val="Compact"/>
+        <w:numPr>
+          <w:ilvl w:val="0"/>
+          <w:numId w:val="1011"/>
+        </w:numPr>
+      </w:pPr>
+      <w:r>
+        <w:t xml:space="preserve">event-case escalation workflow;</w:t>
+      </w:r>
+    </w:p>
+    <w:p>
+      <w:pPr>
+        <w:pStyle w:val="Compact"/>
+        <w:numPr>
+          <w:ilvl w:val="0"/>
+          <w:numId w:val="1011"/>
+        </w:numPr>
+      </w:pPr>
+      <w:r>
+        <w:t xml:space="preserve">a standard taxonomy;</w:t>
+      </w:r>
+    </w:p>
+    <w:p>
+      <w:pPr>
+        <w:pStyle w:val="Compact"/>
+        <w:numPr>
+          <w:ilvl w:val="0"/>
+          <w:numId w:val="1011"/>
+        </w:numPr>
+      </w:pPr>
+      <w:r>
+        <w:t xml:space="preserve">state surveillance cell review;</w:t>
+      </w:r>
+    </w:p>
+    <w:p>
+      <w:pPr>
+        <w:pStyle w:val="Compact"/>
+        <w:numPr>
+          <w:ilvl w:val="0"/>
+          <w:numId w:val="1011"/>
+        </w:numPr>
+      </w:pPr>
+      <w:r>
+        <w:t xml:space="preserve">dashboard and audit functions.</w:t>
+      </w:r>
+    </w:p>
+    <w:bookmarkEnd w:id="31"/>
+    <w:bookmarkStart w:id="32" w:name="Xb80e69b7b2a33485ca053f846f33a4c0490a0d8"/>
+    <w:p>
+      <w:pPr>
+        <w:pStyle w:val="Heading3"/>
+      </w:pPr>
+      <w:r>
+        <w:t xml:space="preserve">Stage 2: interoperability and benchmarking</w:t>
+      </w:r>
+    </w:p>
+    <w:p>
+      <w:pPr>
+        <w:pStyle w:val="FirstParagraph"/>
+      </w:pPr>
+      <w:r>
+        <w:t xml:space="preserve">Once operational use stabilizes, the next step should be:</w:t>
+      </w:r>
+    </w:p>
+    <w:p>
+      <w:pPr>
+        <w:pStyle w:val="Compact"/>
+        <w:numPr>
+          <w:ilvl w:val="0"/>
+          <w:numId w:val="1012"/>
+        </w:numPr>
+      </w:pPr>
+      <w:r>
+        <w:t xml:space="preserve">mapping to digital facility and provider registries;</w:t>
+      </w:r>
+    </w:p>
+    <w:p>
+      <w:pPr>
+        <w:pStyle w:val="Compact"/>
+        <w:numPr>
+          <w:ilvl w:val="0"/>
+          <w:numId w:val="1012"/>
+        </w:numPr>
+      </w:pPr>
+      <w:r>
+        <w:t xml:space="preserve">ingestion from hospital information systems where feasible;</w:t>
+      </w:r>
+    </w:p>
+    <w:p>
+      <w:pPr>
+        <w:pStyle w:val="Compact"/>
+        <w:numPr>
+          <w:ilvl w:val="0"/>
+          <w:numId w:val="1012"/>
+        </w:numPr>
+      </w:pPr>
+      <w:r>
+        <w:t xml:space="preserve">cross-facility comparisons using stable denominators;</w:t>
+      </w:r>
+    </w:p>
+    <w:p>
+      <w:pPr>
+        <w:pStyle w:val="Compact"/>
+        <w:numPr>
+          <w:ilvl w:val="0"/>
+          <w:numId w:val="1012"/>
+        </w:numPr>
+      </w:pPr>
+      <w:r>
+        <w:t xml:space="preserve">district and state-level signal definitions.</w:t>
+      </w:r>
+    </w:p>
+    <w:bookmarkEnd w:id="32"/>
+    <w:bookmarkStart w:id="33" w:name="stage-3-advanced-learning-and-prevention"/>
+    <w:p>
+      <w:pPr>
+        <w:pStyle w:val="Heading3"/>
+      </w:pPr>
+      <w:r>
+        <w:t xml:space="preserve">Stage 3: advanced learning and prevention</w:t>
+      </w:r>
+    </w:p>
+    <w:p>
+      <w:pPr>
+        <w:pStyle w:val="FirstParagraph"/>
+      </w:pPr>
+      <w:r>
+        <w:t xml:space="preserve">Only after stable data quality and review maturity should the system expand into:</w:t>
+      </w:r>
+    </w:p>
+    <w:p>
+      <w:pPr>
+        <w:pStyle w:val="Compact"/>
+        <w:numPr>
+          <w:ilvl w:val="0"/>
+          <w:numId w:val="1013"/>
+        </w:numPr>
+      </w:pPr>
+      <w:r>
+        <w:t xml:space="preserve">AI-assisted triage at scale;</w:t>
+      </w:r>
+    </w:p>
+    <w:p>
+      <w:pPr>
+        <w:pStyle w:val="Compact"/>
+        <w:numPr>
+          <w:ilvl w:val="0"/>
+          <w:numId w:val="1013"/>
+        </w:numPr>
+      </w:pPr>
+      <w:r>
+        <w:t xml:space="preserve">prospective signal ingestion from digital safety tools;</w:t>
+      </w:r>
+    </w:p>
+    <w:p>
+      <w:pPr>
+        <w:pStyle w:val="Compact"/>
+        <w:numPr>
+          <w:ilvl w:val="0"/>
+          <w:numId w:val="1013"/>
+        </w:numPr>
+      </w:pPr>
+      <w:r>
+        <w:t xml:space="preserve">benchmark reporting;</w:t>
+      </w:r>
+    </w:p>
+    <w:p>
+      <w:pPr>
+        <w:pStyle w:val="Compact"/>
+        <w:numPr>
+          <w:ilvl w:val="0"/>
+          <w:numId w:val="1013"/>
+        </w:numPr>
+      </w:pPr>
+      <w:r>
+        <w:t xml:space="preserve">policy dashboards;</w:t>
+      </w:r>
+    </w:p>
+    <w:p>
+      <w:pPr>
+        <w:pStyle w:val="Compact"/>
+        <w:numPr>
+          <w:ilvl w:val="0"/>
+          <w:numId w:val="1013"/>
+        </w:numPr>
+      </w:pPr>
+      <w:r>
+        <w:t xml:space="preserve">research and publication outputs on burden, trends, and intervention effects.</w:t>
+      </w:r>
+    </w:p>
+    <w:bookmarkEnd w:id="33"/>
+    <w:bookmarkEnd w:id="34"/>
+    <w:bookmarkStart w:id="35" w:name="Xae77ca6f0f20b0f92c6dda1090cd2020583fb7a"/>
+    <w:p>
+      <w:pPr>
+        <w:pStyle w:val="Heading2"/>
+      </w:pPr>
+      <w:r>
+        <w:t xml:space="preserve">Strengths and limitations of the proposed framework</w:t>
+      </w:r>
+    </w:p>
+    <w:p>
+      <w:pPr>
+        <w:pStyle w:val="FirstParagraph"/>
+      </w:pPr>
+      <w:r>
+        <w:t xml:space="preserve">The main strength of this framework is that it integrates patient safety reporting, surveillance, learning, and governance rather than addressing them as separate programmes. It is also designed explicitly for Indian health-system realities, including mixed digital maturity and layered governance. Figure 1 summarizes the federated operating model, and Figure 2 depicts the data and learning flow across manual reporting, digital ingestion, analytics, and governance.</w:t>
+      </w:r>
+    </w:p>
+    <w:p>
+      <w:pPr>
+        <w:pStyle w:val="BodyText"/>
+      </w:pPr>
+      <w:r>
+        <w:t xml:space="preserve">The main limitation is that this paper is conceptual and review-based. It does not provide prospective implementation outcomes, burden estimates from multicentric deployment, or measured effect on harm reduction. Those will require phased piloting and evaluation using robust designs. The framework should therefore be interpreted as a systems blueprint for implementation and study, not as proof of effectiveness.</w:t>
+      </w:r>
+    </w:p>
+    <w:bookmarkEnd w:id="35"/>
+    <w:bookmarkStart w:id="36" w:name="conclusion"/>
+    <w:p>
+      <w:pPr>
+        <w:pStyle w:val="Heading2"/>
+      </w:pPr>
+      <w:r>
+        <w:t xml:space="preserve">Conclusion</w:t>
+      </w:r>
+    </w:p>
+    <w:p>
+      <w:pPr>
+        <w:pStyle w:val="FirstParagraph"/>
+      </w:pPr>
+      <w:r>
+        <w:t xml:space="preserve">India needs a patient safety surveillance system that does more than collect incident narratives. A scalable system must distinguish routine surveillance from event-level learning, use a common taxonomy, support facility-to-national review functions, preserve auditability, and be interoperable with the country’s evolving digital health architecture. AI may help with classification and summarization, but the system must remain human-governed and prevention-oriented. A federated patient safety surveillance model offers a realistic path for converting fragmented safety information into structured learning and safer health-system action in India.</w:t>
+      </w:r>
+    </w:p>
+    <w:bookmarkEnd w:id="36"/>
+    <w:bookmarkStart w:id="37" w:name="acknowledgment"/>
+    <w:p>
+      <w:pPr>
+        <w:pStyle w:val="Heading2"/>
+      </w:pPr>
+      <w:r>
+        <w:t xml:space="preserve">Acknowledgment</w:t>
+      </w:r>
+    </w:p>
+    <w:p>
+      <w:pPr>
+        <w:pStyle w:val="FirstParagraph"/>
+      </w:pPr>
+      <w:r>
+        <w:t xml:space="preserve">The author acknowledges the implementation-learning feedback from facility, state, and national workflow simulation exercises conducted during the development of the SentinelCare and India Patient Safety Surveillance frameworks.</w:t>
+      </w:r>
+    </w:p>
+    <w:bookmarkEnd w:id="37"/>
+    <w:bookmarkStart w:id="45" w:name="declarations"/>
+    <w:p>
+      <w:pPr>
+        <w:pStyle w:val="Heading2"/>
+      </w:pPr>
+      <w:r>
+        <w:t xml:space="preserve">Declarations</w:t>
+      </w:r>
+    </w:p>
+    <w:bookmarkStart w:id="38" w:name="Xad4c21cc653cc19fa281b7f2d37b6030518deb4"/>
+    <w:p>
+      <w:pPr>
+        <w:pStyle w:val="Heading3"/>
+      </w:pPr>
+      <w:r>
+        <w:t xml:space="preserve">Ethical approval and consent to participate</w:t>
+      </w:r>
+    </w:p>
+    <w:p>
+      <w:pPr>
+        <w:pStyle w:val="FirstParagraph"/>
+      </w:pPr>
+      <w:r>
+        <w:t xml:space="preserve">Not applicable. This manuscript is a structured narrative review and framework synthesis. No human participants were enrolled, and no primary patient-level dataset was collected or analyzed.</w:t>
+      </w:r>
+    </w:p>
+    <w:bookmarkEnd w:id="38"/>
+    <w:bookmarkStart w:id="39" w:name="consent-for-publication"/>
+    <w:p>
+      <w:pPr>
+        <w:pStyle w:val="Heading3"/>
+      </w:pPr>
+      <w:r>
+        <w:t xml:space="preserve">Consent for publication</w:t>
+      </w:r>
+    </w:p>
+    <w:p>
+      <w:pPr>
+        <w:pStyle w:val="FirstParagraph"/>
+      </w:pPr>
+      <w:r>
+        <w:t xml:space="preserve">Not applicable.</w:t>
+      </w:r>
+    </w:p>
+    <w:bookmarkEnd w:id="39"/>
+    <w:bookmarkStart w:id="40" w:name="availability-of-data-and-materials"/>
+    <w:p>
+      <w:pPr>
+        <w:pStyle w:val="Heading3"/>
+      </w:pPr>
+      <w:r>
+        <w:t xml:space="preserve">Availability of data and materials</w:t>
+      </w:r>
+    </w:p>
+    <w:p>
+      <w:pPr>
+        <w:pStyle w:val="FirstParagraph"/>
+      </w:pPr>
+      <w:r>
+        <w:t xml:space="preserve">No primary analytic dataset was generated for this manuscript. All cited policy documents, guidance sources, and published literature are publicly available through the referenced sources. Code and implementation documentation are available at https://github.com/hssling/sentinelcare-mvp. Live application endpoint: https://mederror-india-surveillance.netlify.app/.</w:t>
+      </w:r>
+    </w:p>
+    <w:bookmarkEnd w:id="40"/>
+    <w:bookmarkStart w:id="41" w:name="funding"/>
+    <w:p>
+      <w:pPr>
+        <w:pStyle w:val="Heading3"/>
+      </w:pPr>
+      <w:r>
+        <w:t xml:space="preserve">Funding</w:t>
+      </w:r>
+    </w:p>
+    <w:p>
+      <w:pPr>
+        <w:pStyle w:val="FirstParagraph"/>
+      </w:pPr>
+      <w:r>
+        <w:t xml:space="preserve">No specific external funding was received for this work.</w:t>
+      </w:r>
+    </w:p>
+    <w:bookmarkEnd w:id="41"/>
+    <w:bookmarkStart w:id="42" w:name="conflicts-of-interest"/>
+    <w:p>
+      <w:pPr>
+        <w:pStyle w:val="Heading3"/>
+      </w:pPr>
+      <w:r>
+        <w:t xml:space="preserve">Conflicts of interest</w:t>
+      </w:r>
+    </w:p>
+    <w:p>
+      <w:pPr>
+        <w:pStyle w:val="FirstParagraph"/>
+      </w:pPr>
+      <w:r>
+        <w:t xml:space="preserve">The author is the originating conceptual lead for the SentinelCare and India Patient Safety Surveillance project frameworks described in this manuscript.</w:t>
+      </w:r>
+    </w:p>
+    <w:bookmarkEnd w:id="42"/>
+    <w:bookmarkStart w:id="43" w:name="author-contributions"/>
+    <w:p>
+      <w:pPr>
+        <w:pStyle w:val="Heading3"/>
+      </w:pPr>
+      <w:r>
+        <w:t xml:space="preserve">Author contributions</w:t>
+      </w:r>
+    </w:p>
+    <w:p>
+      <w:pPr>
+        <w:pStyle w:val="FirstParagraph"/>
+      </w:pPr>
+      <w:r>
+        <w:t xml:space="preserve">The sole author conceived the manuscript, conducted the literature and policy synthesis, developed the framework, and wrote and revised the manuscript.</w:t>
+      </w:r>
+    </w:p>
+    <w:bookmarkEnd w:id="43"/>
+    <w:bookmarkStart w:id="44" w:name="ai-use-disclosure"/>
+    <w:p>
+      <w:pPr>
+        <w:pStyle w:val="Heading3"/>
+      </w:pPr>
+      <w:r>
+        <w:t xml:space="preserve">AI use disclosure</w:t>
+      </w:r>
+    </w:p>
+    <w:p>
+      <w:pPr>
+        <w:pStyle w:val="FirstParagraph"/>
+      </w:pPr>
+      <w:r>
+        <w:t xml:space="preserve">AI-assisted tools were used for drafting support and language organization under direct author supervision. The author reviewed, corrected, and takes full responsibility for the final content.</w:t>
+      </w:r>
+    </w:p>
+    <w:bookmarkEnd w:id="44"/>
+    <w:bookmarkEnd w:id="45"/>
+    <w:bookmarkStart w:id="46" w:name="references"/>
+    <w:p>
+      <w:pPr>
+        <w:pStyle w:val="Heading2"/>
+      </w:pPr>
+      <w:r>
+        <w:t xml:space="preserve">References</w:t>
+      </w:r>
+    </w:p>
+    <w:p>
+      <w:pPr>
+        <w:pStyle w:val="Compact"/>
+        <w:numPr>
+          <w:ilvl w:val="0"/>
+          <w:numId w:val="1014"/>
+        </w:numPr>
+      </w:pPr>
+      <w:r>
+        <w:t xml:space="preserve">World Health Organization. Global patient safety action plan 2021-2030: towards eliminating avoidable harm in health care. Geneva: WHO; 2021.</w:t>
+      </w:r>
+    </w:p>
+    <w:p>
+      <w:pPr>
+        <w:pStyle w:val="Compact"/>
+        <w:numPr>
+          <w:ilvl w:val="0"/>
+          <w:numId w:val="1014"/>
+        </w:numPr>
+      </w:pPr>
+      <w:r>
+        <w:t xml:space="preserve">World Health Organization. Global patient safety report 2024. Geneva: WHO; 2024. Available from: https://iris.who.int/handle/10665/376928, accessed on March 8, 2026.</w:t>
+      </w:r>
+    </w:p>
+    <w:p>
+      <w:pPr>
+        <w:pStyle w:val="Compact"/>
+        <w:numPr>
+          <w:ilvl w:val="0"/>
+          <w:numId w:val="1014"/>
+        </w:numPr>
+      </w:pPr>
+      <w:r>
+        <w:t xml:space="preserve">National Health Authority. Ayushman Bharat Digital Mission resources. Available from: https://www.abdm.gov.in/resources, accessed on March 8, 2026.</w:t>
+      </w:r>
+    </w:p>
+    <w:p>
+      <w:pPr>
+        <w:pStyle w:val="Compact"/>
+        <w:numPr>
+          <w:ilvl w:val="0"/>
+          <w:numId w:val="1014"/>
+        </w:numPr>
+      </w:pPr>
+      <w:r>
+        <w:t xml:space="preserve">National Health Authority. About Ayushman Bharat Digital Mission. Available from: https://nha.gov.in/NDHM, accessed on March 8, 2026.</w:t>
+      </w:r>
+    </w:p>
+    <w:p>
+      <w:pPr>
+        <w:pStyle w:val="Compact"/>
+        <w:numPr>
+          <w:ilvl w:val="0"/>
+          <w:numId w:val="1014"/>
+        </w:numPr>
+      </w:pPr>
+      <w:r>
+        <w:t xml:space="preserve">Ministry of Health and Family Welfare, Government of India. Integrated Health Information Platform. Available from: https://ihip.mohfw.gov.in/, accessed on March 8, 2026.</w:t>
+      </w:r>
+    </w:p>
+    <w:p>
+      <w:pPr>
+        <w:pStyle w:val="Compact"/>
+        <w:numPr>
+          <w:ilvl w:val="0"/>
+          <w:numId w:val="1014"/>
+        </w:numPr>
+      </w:pPr>
+      <w:r>
+        <w:t xml:space="preserve">Health Quality Ontario. Patient safety learning systems: a systematic review and qualitative synthesis. Ont Health Technol Assess Ser 2017;17:1-23. Available from: https://pmc.ncbi.nlm.nih.gov/articles/PMC5357133/, accessed on March 8, 2026.</w:t>
+      </w:r>
+    </w:p>
+    <w:p>
+      <w:pPr>
+        <w:pStyle w:val="Compact"/>
+        <w:numPr>
+          <w:ilvl w:val="0"/>
+          <w:numId w:val="1014"/>
+        </w:numPr>
+      </w:pPr>
+      <w:r>
+        <w:t xml:space="preserve">Kuitunen I, Ponkilainen V, Hallila H, Nuutinen M, Alanen V, Reponiemi T, et al. Patient safety incident reporting and learning guidelines implemented by health care professionals in specialized care units: scoping review. J Med Internet Res 2024;26:e55971. Available from: https://pmc.ncbi.nlm.nih.gov/articles/PMC11489802/, accessed on March 8, 2026.</w:t>
+      </w:r>
+    </w:p>
+    <w:p>
+      <w:pPr>
+        <w:pStyle w:val="Compact"/>
+        <w:numPr>
+          <w:ilvl w:val="0"/>
+          <w:numId w:val="1014"/>
+        </w:numPr>
+      </w:pPr>
+      <w:r>
+        <w:t xml:space="preserve">National Accreditation Board for Hospitals and Healthcare Providers. NABH standards. Available from: https://nabh.co/nabh-standards/, accessed on March 8, 2026.</w:t>
+      </w:r>
+    </w:p>
+    <w:p>
+      <w:pPr>
+        <w:pStyle w:val="Compact"/>
+        <w:numPr>
+          <w:ilvl w:val="0"/>
+          <w:numId w:val="1014"/>
+        </w:numPr>
+      </w:pPr>
+      <w:r>
+        <w:t xml:space="preserve">World Health Organization. Ethics and governance of artificial intelligence for health. Geneva: WHO; 2021.</w:t>
+      </w:r>
+    </w:p>
+    <w:p>
+      <w:pPr>
+        <w:pStyle w:val="Compact"/>
+        <w:numPr>
+          <w:ilvl w:val="0"/>
+          <w:numId w:val="1014"/>
+        </w:numPr>
+      </w:pPr>
+      <w:r>
+        <w:t xml:space="preserve">International Committee of Medical Journal Editors. Recommendations for the conduct, reporting, editing, and publication of scholarly work in medical journals. Available from: https://www.icmje.org/, accessed on March 8, 2026.</w:t>
+      </w:r>
+    </w:p>
+    <w:p>
+      <w:pPr>
+        <w:pStyle w:val="Compact"/>
+        <w:numPr>
+          <w:ilvl w:val="0"/>
+          <w:numId w:val="1014"/>
+        </w:numPr>
+      </w:pPr>
+      <w:r>
+        <w:t xml:space="preserve">EQUATOR Network. Enhancing the quality and transparency of health research. Available from: https://www.equator-network.org/, accessed on March 8, 2026.</w:t>
+      </w:r>
+    </w:p>
+    <w:p>
+      <w:pPr>
+        <w:pStyle w:val="Compact"/>
+        <w:numPr>
+          <w:ilvl w:val="0"/>
+          <w:numId w:val="1014"/>
+        </w:numPr>
+      </w:pPr>
+      <w:r>
+        <w:t xml:space="preserve">Indian Council of Medical Research. National ethical guidelines for biomedical and health research involving human participants. New Delhi: ICMR; 2017. Available from: https://www.icmr.gov.in/icmrobject/custom_data/pdf/resource-guidelines/ICMR_Ethical_Guidelines_2017.pdf, accessed on March 8, 2026.</w:t>
+      </w:r>
+    </w:p>
+    <w:p>
+      <w:pPr>
+        <w:pStyle w:val="Compact"/>
+        <w:numPr>
+          <w:ilvl w:val="0"/>
+          <w:numId w:val="1014"/>
+        </w:numPr>
+      </w:pPr>
+      <w:r>
+        <w:t xml:space="preserve">World Health Organization. Progress on patient safety across health systems around the world. Available from: https://www.who.int/news/item/23-05-2025-progress-on-patient-safety-across-health-systems-around-the-world, accessed on March 8, 2026.</w:t>
+      </w:r>
+    </w:p>
+    <w:p>
+      <w:pPr>
+        <w:pStyle w:val="Compact"/>
+        <w:numPr>
+          <w:ilvl w:val="0"/>
+          <w:numId w:val="1014"/>
+        </w:numPr>
+      </w:pPr>
+      <w:r>
+        <w:t xml:space="preserve">Garg S, Gangadharan N, Bhatnagar N, Singh MM, Raina SK, Galwankar S. The Ayushman Bharat Digital Mission of India: an assessment. J Med Syst 2024;48:123.</w:t>
+      </w:r>
+    </w:p>
+    <w:p>
+      <w:pPr>
+        <w:pStyle w:val="Compact"/>
+        <w:numPr>
+          <w:ilvl w:val="0"/>
+          <w:numId w:val="1014"/>
+        </w:numPr>
+      </w:pPr>
+      <w:r>
+        <w:t xml:space="preserve">Leape LL. Reporting of adverse events. N Engl J Med 2002;347:1633-8.</w:t>
+      </w:r>
+    </w:p>
+    <w:p>
+      <w:pPr>
+        <w:pStyle w:val="Compact"/>
+        <w:numPr>
+          <w:ilvl w:val="0"/>
+          <w:numId w:val="1014"/>
+        </w:numPr>
+      </w:pPr>
+      <w:r>
+        <w:t xml:space="preserve">Barach P, Small SD. Reporting and preventing medical mishaps: lessons from non-medical near miss reporting systems. BMJ 2000;320:759-63.</w:t>
+      </w:r>
+    </w:p>
+    <w:p>
+      <w:pPr>
+        <w:pStyle w:val="Compact"/>
+        <w:numPr>
+          <w:ilvl w:val="0"/>
+          <w:numId w:val="1014"/>
+        </w:numPr>
+      </w:pPr>
+      <w:r>
+        <w:t xml:space="preserve">Pham JC, Girard T, Pronovost PJ. What to do with healthcare incident reporting systems. J Public Health Res 2013;2:e27.</w:t>
+      </w:r>
+    </w:p>
+    <w:p>
+      <w:pPr>
+        <w:pStyle w:val="Compact"/>
+        <w:numPr>
+          <w:ilvl w:val="0"/>
+          <w:numId w:val="1014"/>
+        </w:numPr>
+      </w:pPr>
+      <w:r>
+        <w:t xml:space="preserve">Stavropoulou C, Doherty C, Tosey P. How effective are incident-reporting systems for improving patient safety? A systematic literature review. Milbank Q 2015;93:826-66.</w:t>
+      </w:r>
+    </w:p>
+    <w:p>
+      <w:pPr>
+        <w:pStyle w:val="Compact"/>
+        <w:numPr>
+          <w:ilvl w:val="0"/>
+          <w:numId w:val="1014"/>
+        </w:numPr>
+      </w:pPr>
+      <w:r>
+        <w:t xml:space="preserve">Mitchell I, Schuster A, Smith K, Pronovost P, Wu A. Patient safety incident reporting: a qualitative study of thoughts and perceptions of experts 15 years after</w:t>
+      </w:r>
+      <w:r>
+        <w:t xml:space="preserve"> </w:t>
+      </w:r>
+      <w:r>
+        <w:t xml:space="preserve">‘To Err Is Human’</w:t>
+      </w:r>
+      <w:r>
+        <w:t xml:space="preserve">. BMJ Qual Saf 2016;25:92-9.</w:t>
+      </w:r>
+    </w:p>
+    <w:p>
+      <w:pPr>
+        <w:pStyle w:val="Compact"/>
+        <w:numPr>
+          <w:ilvl w:val="0"/>
+          <w:numId w:val="1014"/>
+        </w:numPr>
+      </w:pPr>
+      <w:r>
+        <w:t xml:space="preserve">Agency for Healthcare Research and Quality. Patient safety organizations and learning systems. Available from: https://www.ahrq.gov/patient-safety/reporting.html, accessed on March 8, 2026.</w:t>
+      </w:r>
+    </w:p>
+    <w:p>
+      <w:pPr>
+        <w:pStyle w:val="Compact"/>
+        <w:numPr>
+          <w:ilvl w:val="0"/>
+          <w:numId w:val="1014"/>
+        </w:numPr>
+      </w:pPr>
+      <w:r>
+        <w:t xml:space="preserve">Bates DW, Singh H. Two decades since To Err Is Human: an assessment of progress and emerging priorities in patient safety. Health Aff 2018;37:1736-43.</w:t>
+      </w:r>
+    </w:p>
+    <w:p>
+      <w:pPr>
+        <w:pStyle w:val="Compact"/>
+        <w:numPr>
+          <w:ilvl w:val="0"/>
+          <w:numId w:val="1014"/>
+        </w:numPr>
+      </w:pPr>
+      <w:r>
+        <w:t xml:space="preserve">Singh H, Sittig DF. Advancing the science of measurement of diagnostic errors in healthcare. BMJ Qual Saf 2015;24:103-10.</w:t>
+      </w:r>
+    </w:p>
+    <w:p>
+      <w:pPr>
+        <w:pStyle w:val="Compact"/>
+        <w:numPr>
+          <w:ilvl w:val="0"/>
+          <w:numId w:val="1014"/>
+        </w:numPr>
+      </w:pPr>
+      <w:r>
+        <w:t xml:space="preserve">World Health Organization. World patient safety day 2024 campaign materials. Available from: https://www.who.int/campaigns/world-patient-safety-day/2024, accessed on March 8, 2026.</w:t>
+      </w:r>
+    </w:p>
+    <w:p>
+      <w:pPr>
+        <w:pStyle w:val="Compact"/>
+        <w:numPr>
+          <w:ilvl w:val="0"/>
+          <w:numId w:val="1014"/>
+        </w:numPr>
+      </w:pPr>
+      <w:r>
+        <w:t xml:space="preserve">World Bank. India - transforming India’s public health surveillance through digital systems. Available from: https://documents1.worldbank.org/curated/en/099145106042242190/pdf/P175676001543d000b7c709870c0c3375b.pdf, accessed on March 8, 2026.</w:t>
+      </w:r>
+    </w:p>
+    <w:p>
+      <w:pPr>
+        <w:pStyle w:val="Compact"/>
+        <w:numPr>
+          <w:ilvl w:val="0"/>
+          <w:numId w:val="1014"/>
+        </w:numPr>
+      </w:pPr>
+      <w:r>
+        <w:t xml:space="preserve">Flemons WW, McRae G. Reporting, learning and the culture of safety. Healthc Q 2012;15 Spec No:12-7.</w:t>
+      </w:r>
+    </w:p>
+    <w:bookmarkEnd w:id="46"/>
+    <w:bookmarkStart w:id="47" w:name="X374842f1e24a661a677228713234239f638ef38"/>
+    <w:p>
+      <w:pPr>
+        <w:pStyle w:val="Heading2"/>
+      </w:pPr>
+      <w:r>
+        <w:t xml:space="preserve">Table I. Core design requirements for a federated patient safety surveillance system in India</w:t>
       </w:r>
     </w:p>
     <w:tbl>
@@ -1118,1190 +2328,84 @@
         </w:tc>
       </w:tr>
     </w:tbl>
+    <w:bookmarkEnd w:id="47"/>
+    <w:bookmarkStart w:id="48" w:name="legends-to-figures"/>
+    <w:p>
+      <w:pPr>
+        <w:pStyle w:val="Heading2"/>
+      </w:pPr>
+      <w:r>
+        <w:t xml:space="preserve">Legends to Figures</w:t>
+      </w:r>
+    </w:p>
+    <w:p>
+      <w:pPr>
+        <w:pStyle w:val="FirstParagraph"/>
+      </w:pPr>
+      <w:r>
+        <w:rPr>
+          <w:b/>
+          <w:bCs/>
+        </w:rPr>
+        <w:t xml:space="preserve">Figure 1.</w:t>
+      </w:r>
+      <w:r>
+        <w:t xml:space="preserve"> </w:t>
+      </w:r>
+      <w:r>
+        <w:t xml:space="preserve">Federated operating model for patient safety surveillance in India.</w:t>
+      </w:r>
+      <w:r>
+        <w:br/>
+      </w:r>
+      <w:r>
+        <w:t xml:space="preserve">The surveillance model is organized across facility, state, and national layers. Daily operational surveillance and event-level learning cases originate at facility level. State surveillance cells perform aggregation, signal review, and escalation. National governance functions synthesize trends, policy implications, and benchmarking outputs.</w:t>
+      </w:r>
+    </w:p>
     <w:p>
       <w:pPr>
         <w:pStyle w:val="BodyText"/>
       </w:pPr>
       <w:r>
-        <w:t xml:space="preserve">The surveillance system should include durable audit trails, policy linkage, role-aware permissions, and documented closure logic. Governance is not an add-on; it is what distinguishes learning from passive reporting. Policy versions, escalations, and CAPA records should be queryable and reviewable.</w:t>
-      </w:r>
-    </w:p>
-    <w:bookmarkEnd w:id="21"/>
-    <w:bookmarkEnd w:id="22"/>
-    <w:bookmarkStart w:id="26" w:name="digital-integration-requirements"/>
+        <w:rPr>
+          <w:b/>
+          <w:bCs/>
+        </w:rPr>
+        <w:t xml:space="preserve">Figure 2.</w:t>
+      </w:r>
+      <w:r>
+        <w:t xml:space="preserve"> </w:t>
+      </w:r>
+      <w:r>
+        <w:t xml:space="preserve">Unified data and learning flow.</w:t>
+      </w:r>
+      <w:r>
+        <w:br/>
+      </w:r>
+      <w:r>
+        <w:t xml:space="preserve">Manual submissions, digital system events, and future machine-detected signals flow into a common safety intelligence layer. Triage, investigation, CAPA, analytics, AI assistance, and governance review operate on the normalized event stream, allowing both local action and system-level learning.</w:t>
+      </w:r>
+    </w:p>
+    <w:bookmarkEnd w:id="48"/>
+    <w:bookmarkStart w:id="49" w:name="figures"/>
     <w:p>
       <w:pPr>
         <w:pStyle w:val="Heading2"/>
       </w:pPr>
       <w:r>
-        <w:t xml:space="preserve">Digital integration requirements</w:t>
-      </w:r>
-    </w:p>
-    <w:p>
-      <w:pPr>
-        <w:pStyle w:val="FirstParagraph"/>
-      </w:pPr>
-      <w:r>
-        <w:t xml:space="preserve">India’s future patient safety surveillance system should be interoperable rather than monolithic.</w:t>
-      </w:r>
-    </w:p>
-    <w:bookmarkStart w:id="23" w:name="abdm-aligned-readiness"/>
-    <w:p>
-      <w:pPr>
-        <w:pStyle w:val="Heading3"/>
-      </w:pPr>
-      <w:r>
-        <w:t xml:space="preserve">ABDM-aligned readiness</w:t>
-      </w:r>
-    </w:p>
-    <w:p>
-      <w:pPr>
-        <w:pStyle w:val="FirstParagraph"/>
-      </w:pPr>
-      <w:r>
-        <w:t xml:space="preserve">ABDM provides a relevant enabling direction through digital identity, registries, and interoperability-oriented infrastructure.</w:t>
-      </w:r>
-      <w:r>
-        <w:t xml:space="preserve">3,4</w:t>
-      </w:r>
-      <w:r>
-        <w:t xml:space="preserve"> </w:t>
-      </w:r>
-      <w:r>
-        <w:t xml:space="preserve">A patient safety surveillance platform should be able to use these assets without being dependent on them for all workflows. Facility, department, and provider identities should be mappable to standardized registries where available.</w:t>
-      </w:r>
-    </w:p>
-    <w:bookmarkEnd w:id="23"/>
-    <w:bookmarkStart w:id="24" w:name="manual-plus-digital-ingestion"/>
-    <w:p>
-      <w:pPr>
-        <w:pStyle w:val="Heading3"/>
-      </w:pPr>
-      <w:r>
-        <w:t xml:space="preserve">Manual-plus-digital ingestion</w:t>
-      </w:r>
-    </w:p>
-    <w:p>
-      <w:pPr>
-        <w:pStyle w:val="FirstParagraph"/>
-      </w:pPr>
-      <w:r>
-        <w:t xml:space="preserve">The system should accept more than one input mode:</w:t>
-      </w:r>
-    </w:p>
-    <w:p>
-      <w:pPr>
-        <w:pStyle w:val="Compact"/>
-        <w:numPr>
-          <w:ilvl w:val="0"/>
-          <w:numId w:val="1007"/>
-        </w:numPr>
-      </w:pPr>
-      <w:r>
-        <w:t xml:space="preserve">manual department submissions</w:t>
-      </w:r>
-    </w:p>
-    <w:p>
-      <w:pPr>
-        <w:pStyle w:val="Compact"/>
-        <w:numPr>
-          <w:ilvl w:val="0"/>
-          <w:numId w:val="1007"/>
-        </w:numPr>
-      </w:pPr>
-      <w:r>
-        <w:t xml:space="preserve">manually entered event cases</w:t>
-      </w:r>
-    </w:p>
-    <w:p>
-      <w:pPr>
-        <w:pStyle w:val="Compact"/>
-        <w:numPr>
-          <w:ilvl w:val="0"/>
-          <w:numId w:val="1007"/>
-        </w:numPr>
-      </w:pPr>
-      <w:r>
-        <w:t xml:space="preserve">imported digital events from hospital systems</w:t>
-      </w:r>
-    </w:p>
-    <w:p>
-      <w:pPr>
-        <w:pStyle w:val="Compact"/>
-        <w:numPr>
-          <w:ilvl w:val="0"/>
-          <w:numId w:val="1007"/>
-        </w:numPr>
-      </w:pPr>
-      <w:r>
-        <w:t xml:space="preserve">machine-detected cases or signals from prospective safety tools such as SentinelCare</w:t>
-      </w:r>
-    </w:p>
-    <w:p>
-      <w:pPr>
-        <w:pStyle w:val="FirstParagraph"/>
-      </w:pPr>
-      <w:r>
-        <w:t xml:space="preserve">This is important because many Indian facilities will initially operate in mixed digital maturity states. A surveillance system that only works with fully digital institutions will exclude much of the real care ecosystem; one that only supports manual entry will not scale well for digital hospitals.</w:t>
-      </w:r>
-    </w:p>
-    <w:bookmarkEnd w:id="24"/>
-    <w:bookmarkStart w:id="25" w:name="data-protection-and-minimality"/>
-    <w:p>
-      <w:pPr>
-        <w:pStyle w:val="Heading3"/>
-      </w:pPr>
-      <w:r>
-        <w:t xml:space="preserve">Data protection and minimality</w:t>
-      </w:r>
-    </w:p>
-    <w:p>
-      <w:pPr>
-        <w:pStyle w:val="FirstParagraph"/>
-      </w:pPr>
-      <w:r>
-        <w:t xml:space="preserve">Not every signal requires identifiable patient detail at higher levels. Facility-level investigation may require identifiable information, but state and national learning layers should preferentially use minimized, structured, role-appropriate records. This protects confidentiality while preserving learning utility.</w:t>
-      </w:r>
-    </w:p>
-    <w:bookmarkEnd w:id="25"/>
-    <w:bookmarkEnd w:id="26"/>
-    <w:bookmarkStart w:id="30" w:name="where-ai-can-and-cannot-help"/>
-    <w:p>
-      <w:pPr>
-        <w:pStyle w:val="Heading2"/>
-      </w:pPr>
-      <w:r>
-        <w:t xml:space="preserve">Where AI can and cannot help</w:t>
-      </w:r>
-    </w:p>
-    <w:p>
-      <w:pPr>
-        <w:pStyle w:val="FirstParagraph"/>
-      </w:pPr>
-      <w:r>
-        <w:t xml:space="preserve">There is growing interest in applying AI to safety reporting and classification. However, a national patient safety surveillance system should use AI cautiously and transparently.</w:t>
-      </w:r>
-    </w:p>
-    <w:bookmarkStart w:id="27" w:name="appropriate-uses"/>
-    <w:p>
-      <w:pPr>
-        <w:pStyle w:val="Heading3"/>
-      </w:pPr>
-      <w:r>
-        <w:t xml:space="preserve">Appropriate uses</w:t>
-      </w:r>
-    </w:p>
-    <w:p>
-      <w:pPr>
-        <w:pStyle w:val="FirstParagraph"/>
-      </w:pPr>
-      <w:r>
-        <w:t xml:space="preserve">AI can be helpful in bounded tasks such as:</w:t>
-      </w:r>
-    </w:p>
-    <w:p>
-      <w:pPr>
-        <w:pStyle w:val="Compact"/>
-        <w:numPr>
-          <w:ilvl w:val="0"/>
-          <w:numId w:val="1008"/>
-        </w:numPr>
-      </w:pPr>
-      <w:r>
-        <w:t xml:space="preserve">converting free-text narratives into structured candidate fields;</w:t>
-      </w:r>
-    </w:p>
-    <w:p>
-      <w:pPr>
-        <w:pStyle w:val="Compact"/>
-        <w:numPr>
-          <w:ilvl w:val="0"/>
-          <w:numId w:val="1008"/>
-        </w:numPr>
-      </w:pPr>
-      <w:r>
-        <w:t xml:space="preserve">suggesting domain and deviation classes;</w:t>
-      </w:r>
-    </w:p>
-    <w:p>
-      <w:pPr>
-        <w:pStyle w:val="Compact"/>
-        <w:numPr>
-          <w:ilvl w:val="0"/>
-          <w:numId w:val="1008"/>
-        </w:numPr>
-      </w:pPr>
-      <w:r>
-        <w:t xml:space="preserve">clustering similar incidents across facilities;</w:t>
-      </w:r>
-    </w:p>
-    <w:p>
-      <w:pPr>
-        <w:pStyle w:val="Compact"/>
-        <w:numPr>
-          <w:ilvl w:val="0"/>
-          <w:numId w:val="1008"/>
-        </w:numPr>
-      </w:pPr>
-      <w:r>
-        <w:t xml:space="preserve">drafting concise summaries for reviewers;</w:t>
-      </w:r>
-    </w:p>
-    <w:p>
-      <w:pPr>
-        <w:pStyle w:val="Compact"/>
-        <w:numPr>
-          <w:ilvl w:val="0"/>
-          <w:numId w:val="1008"/>
-        </w:numPr>
-      </w:pPr>
-      <w:r>
-        <w:t xml:space="preserve">surfacing missing information for investigation;</w:t>
-      </w:r>
-    </w:p>
-    <w:p>
-      <w:pPr>
-        <w:pStyle w:val="Compact"/>
-        <w:numPr>
-          <w:ilvl w:val="0"/>
-          <w:numId w:val="1008"/>
-        </w:numPr>
-      </w:pPr>
-      <w:r>
-        <w:t xml:space="preserve">supporting trend interpretation and bulletin drafting.</w:t>
-      </w:r>
-    </w:p>
-    <w:p>
-      <w:pPr>
-        <w:pStyle w:val="FirstParagraph"/>
-      </w:pPr>
-      <w:r>
-        <w:t xml:space="preserve">These uses reduce review burden and improve consistency without displacing human authority.</w:t>
-      </w:r>
-    </w:p>
-    <w:bookmarkEnd w:id="27"/>
-    <w:bookmarkStart w:id="28" w:name="inappropriate-uses"/>
-    <w:p>
-      <w:pPr>
-        <w:pStyle w:val="Heading3"/>
-      </w:pPr>
-      <w:r>
-        <w:t xml:space="preserve">Inappropriate uses</w:t>
-      </w:r>
-    </w:p>
-    <w:p>
-      <w:pPr>
-        <w:pStyle w:val="FirstParagraph"/>
-      </w:pPr>
-      <w:r>
-        <w:t xml:space="preserve">AI should not autonomously:</w:t>
-      </w:r>
-    </w:p>
-    <w:p>
-      <w:pPr>
-        <w:pStyle w:val="Compact"/>
-        <w:numPr>
-          <w:ilvl w:val="0"/>
-          <w:numId w:val="1009"/>
-        </w:numPr>
-      </w:pPr>
-      <w:r>
-        <w:t xml:space="preserve">determine final severity in serious cases;</w:t>
-      </w:r>
-    </w:p>
-    <w:p>
-      <w:pPr>
-        <w:pStyle w:val="Compact"/>
-        <w:numPr>
-          <w:ilvl w:val="0"/>
-          <w:numId w:val="1009"/>
-        </w:numPr>
-      </w:pPr>
-      <w:r>
-        <w:t xml:space="preserve">assign blame or punitive consequence;</w:t>
-      </w:r>
-    </w:p>
-    <w:p>
-      <w:pPr>
-        <w:pStyle w:val="Compact"/>
-        <w:numPr>
-          <w:ilvl w:val="0"/>
-          <w:numId w:val="1009"/>
-        </w:numPr>
-      </w:pPr>
-      <w:r>
-        <w:t xml:space="preserve">close serious cases;</w:t>
-      </w:r>
-    </w:p>
-    <w:p>
-      <w:pPr>
-        <w:pStyle w:val="Compact"/>
-        <w:numPr>
-          <w:ilvl w:val="0"/>
-          <w:numId w:val="1009"/>
-        </w:numPr>
-      </w:pPr>
-      <w:r>
-        <w:t xml:space="preserve">replace governance review;</w:t>
-      </w:r>
-    </w:p>
-    <w:p>
-      <w:pPr>
-        <w:pStyle w:val="Compact"/>
-        <w:numPr>
-          <w:ilvl w:val="0"/>
-          <w:numId w:val="1009"/>
-        </w:numPr>
-      </w:pPr>
-      <w:r>
-        <w:t xml:space="preserve">make unsupported claims about causality.</w:t>
-      </w:r>
-    </w:p>
-    <w:p>
-      <w:pPr>
-        <w:pStyle w:val="FirstParagraph"/>
-      </w:pPr>
-      <w:r>
-        <w:t xml:space="preserve">The WHO and broader health AI governance literature emphasize the need for transparency, accountability, human oversight, and fitness for purpose.</w:t>
-      </w:r>
-      <w:r>
-        <w:t xml:space="preserve">2,9</w:t>
-      </w:r>
-      <w:r>
-        <w:t xml:space="preserve"> </w:t>
-      </w:r>
-      <w:r>
-        <w:t xml:space="preserve">In the Indian context, these principles are especially important because patient safety systems must build trust, not deepen opacity.</w:t>
-      </w:r>
-    </w:p>
-    <w:bookmarkEnd w:id="28"/>
-    <w:bookmarkStart w:id="29" w:name="governance-requirements-for-ai"/>
-    <w:p>
-      <w:pPr>
-        <w:pStyle w:val="Heading3"/>
-      </w:pPr>
-      <w:r>
-        <w:t xml:space="preserve">Governance requirements for AI</w:t>
-      </w:r>
-    </w:p>
-    <w:p>
-      <w:pPr>
-        <w:pStyle w:val="FirstParagraph"/>
-      </w:pPr>
-      <w:r>
-        <w:t xml:space="preserve">An AI-enabled patient safety system should document:</w:t>
-      </w:r>
-    </w:p>
-    <w:p>
-      <w:pPr>
-        <w:pStyle w:val="Compact"/>
-        <w:numPr>
-          <w:ilvl w:val="0"/>
-          <w:numId w:val="1010"/>
-        </w:numPr>
-      </w:pPr>
-      <w:r>
-        <w:t xml:space="preserve">provider and model used;</w:t>
-      </w:r>
-    </w:p>
-    <w:p>
-      <w:pPr>
-        <w:pStyle w:val="Compact"/>
-        <w:numPr>
-          <w:ilvl w:val="0"/>
-          <w:numId w:val="1010"/>
-        </w:numPr>
-      </w:pPr>
-      <w:r>
-        <w:t xml:space="preserve">task purpose;</w:t>
-      </w:r>
-    </w:p>
-    <w:p>
-      <w:pPr>
-        <w:pStyle w:val="Compact"/>
-        <w:numPr>
-          <w:ilvl w:val="0"/>
-          <w:numId w:val="1010"/>
-        </w:numPr>
-      </w:pPr>
-      <w:r>
-        <w:t xml:space="preserve">human reviewer override;</w:t>
-      </w:r>
-    </w:p>
-    <w:p>
-      <w:pPr>
-        <w:pStyle w:val="Compact"/>
-        <w:numPr>
-          <w:ilvl w:val="0"/>
-          <w:numId w:val="1010"/>
-        </w:numPr>
-      </w:pPr>
-      <w:r>
-        <w:t xml:space="preserve">confidence or uncertainty marker where appropriate;</w:t>
-      </w:r>
-    </w:p>
-    <w:p>
-      <w:pPr>
-        <w:pStyle w:val="Compact"/>
-        <w:numPr>
-          <w:ilvl w:val="0"/>
-          <w:numId w:val="1010"/>
-        </w:numPr>
-      </w:pPr>
-      <w:r>
-        <w:t xml:space="preserve">audit trail of AI-assisted outputs.</w:t>
-      </w:r>
-    </w:p>
-    <w:p>
-      <w:pPr>
-        <w:pStyle w:val="FirstParagraph"/>
-      </w:pPr>
-      <w:r>
-        <w:t xml:space="preserve">In other words, AI should function as an assistive layer within governance, not as the governance mechanism itself.</w:t>
-      </w:r>
-    </w:p>
-    <w:bookmarkEnd w:id="29"/>
-    <w:bookmarkEnd w:id="30"/>
-    <w:bookmarkStart w:id="34" w:name="implementation-priorities-for-india"/>
-    <w:p>
-      <w:pPr>
-        <w:pStyle w:val="Heading2"/>
-      </w:pPr>
-      <w:r>
-        <w:t xml:space="preserve">Implementation priorities for India</w:t>
-      </w:r>
-    </w:p>
-    <w:p>
-      <w:pPr>
-        <w:pStyle w:val="FirstParagraph"/>
-      </w:pPr>
-      <w:r>
-        <w:t xml:space="preserve">A realistic national rollout should proceed in stages.</w:t>
-      </w:r>
-    </w:p>
-    <w:bookmarkStart w:id="31" w:name="stage-1-facility-and-state-pilot"/>
-    <w:p>
-      <w:pPr>
-        <w:pStyle w:val="Heading3"/>
-      </w:pPr>
-      <w:r>
-        <w:t xml:space="preserve">Stage 1: facility and state pilot</w:t>
-      </w:r>
-    </w:p>
-    <w:p>
-      <w:pPr>
-        <w:pStyle w:val="FirstParagraph"/>
-      </w:pPr>
-      <w:r>
-        <w:t xml:space="preserve">Initial pilots should focus on:</w:t>
-      </w:r>
-    </w:p>
-    <w:p>
-      <w:pPr>
-        <w:pStyle w:val="Compact"/>
-        <w:numPr>
-          <w:ilvl w:val="0"/>
-          <w:numId w:val="1011"/>
-        </w:numPr>
-      </w:pPr>
-      <w:r>
-        <w:t xml:space="preserve">a minimum daily surveillance dataset;</w:t>
-      </w:r>
-    </w:p>
-    <w:p>
-      <w:pPr>
-        <w:pStyle w:val="Compact"/>
-        <w:numPr>
-          <w:ilvl w:val="0"/>
-          <w:numId w:val="1011"/>
-        </w:numPr>
-      </w:pPr>
-      <w:r>
-        <w:t xml:space="preserve">event-case escalation workflow;</w:t>
-      </w:r>
-    </w:p>
-    <w:p>
-      <w:pPr>
-        <w:pStyle w:val="Compact"/>
-        <w:numPr>
-          <w:ilvl w:val="0"/>
-          <w:numId w:val="1011"/>
-        </w:numPr>
-      </w:pPr>
-      <w:r>
-        <w:t xml:space="preserve">a standard taxonomy;</w:t>
-      </w:r>
-    </w:p>
-    <w:p>
-      <w:pPr>
-        <w:pStyle w:val="Compact"/>
-        <w:numPr>
-          <w:ilvl w:val="0"/>
-          <w:numId w:val="1011"/>
-        </w:numPr>
-      </w:pPr>
-      <w:r>
-        <w:t xml:space="preserve">state surveillance cell review;</w:t>
-      </w:r>
-    </w:p>
-    <w:p>
-      <w:pPr>
-        <w:pStyle w:val="Compact"/>
-        <w:numPr>
-          <w:ilvl w:val="0"/>
-          <w:numId w:val="1011"/>
-        </w:numPr>
-      </w:pPr>
-      <w:r>
-        <w:t xml:space="preserve">dashboard and audit functions.</w:t>
-      </w:r>
-    </w:p>
-    <w:bookmarkEnd w:id="31"/>
-    <w:bookmarkStart w:id="32" w:name="Xb80e69b7b2a33485ca053f846f33a4c0490a0d8"/>
-    <w:p>
-      <w:pPr>
-        <w:pStyle w:val="Heading3"/>
-      </w:pPr>
-      <w:r>
-        <w:t xml:space="preserve">Stage 2: interoperability and benchmarking</w:t>
-      </w:r>
-    </w:p>
-    <w:p>
-      <w:pPr>
-        <w:pStyle w:val="FirstParagraph"/>
-      </w:pPr>
-      <w:r>
-        <w:t xml:space="preserve">Once operational use stabilizes, the next step should be:</w:t>
-      </w:r>
-    </w:p>
-    <w:p>
-      <w:pPr>
-        <w:pStyle w:val="Compact"/>
-        <w:numPr>
-          <w:ilvl w:val="0"/>
-          <w:numId w:val="1012"/>
-        </w:numPr>
-      </w:pPr>
-      <w:r>
-        <w:t xml:space="preserve">mapping to digital facility and provider registries;</w:t>
-      </w:r>
-    </w:p>
-    <w:p>
-      <w:pPr>
-        <w:pStyle w:val="Compact"/>
-        <w:numPr>
-          <w:ilvl w:val="0"/>
-          <w:numId w:val="1012"/>
-        </w:numPr>
-      </w:pPr>
-      <w:r>
-        <w:t xml:space="preserve">ingestion from hospital information systems where feasible;</w:t>
-      </w:r>
-    </w:p>
-    <w:p>
-      <w:pPr>
-        <w:pStyle w:val="Compact"/>
-        <w:numPr>
-          <w:ilvl w:val="0"/>
-          <w:numId w:val="1012"/>
-        </w:numPr>
-      </w:pPr>
-      <w:r>
-        <w:t xml:space="preserve">cross-facility comparisons using stable denominators;</w:t>
-      </w:r>
-    </w:p>
-    <w:p>
-      <w:pPr>
-        <w:pStyle w:val="Compact"/>
-        <w:numPr>
-          <w:ilvl w:val="0"/>
-          <w:numId w:val="1012"/>
-        </w:numPr>
-      </w:pPr>
-      <w:r>
-        <w:t xml:space="preserve">district and state-level signal definitions.</w:t>
-      </w:r>
-    </w:p>
-    <w:bookmarkEnd w:id="32"/>
-    <w:bookmarkStart w:id="33" w:name="stage-3-advanced-learning-and-prevention"/>
-    <w:p>
-      <w:pPr>
-        <w:pStyle w:val="Heading3"/>
-      </w:pPr>
-      <w:r>
-        <w:t xml:space="preserve">Stage 3: advanced learning and prevention</w:t>
-      </w:r>
-    </w:p>
-    <w:p>
-      <w:pPr>
-        <w:pStyle w:val="FirstParagraph"/>
-      </w:pPr>
-      <w:r>
-        <w:t xml:space="preserve">Only after stable data quality and review maturity should the system expand into:</w:t>
-      </w:r>
-    </w:p>
-    <w:p>
-      <w:pPr>
-        <w:pStyle w:val="Compact"/>
-        <w:numPr>
-          <w:ilvl w:val="0"/>
-          <w:numId w:val="1013"/>
-        </w:numPr>
-      </w:pPr>
-      <w:r>
-        <w:t xml:space="preserve">AI-assisted triage at scale;</w:t>
-      </w:r>
-    </w:p>
-    <w:p>
-      <w:pPr>
-        <w:pStyle w:val="Compact"/>
-        <w:numPr>
-          <w:ilvl w:val="0"/>
-          <w:numId w:val="1013"/>
-        </w:numPr>
-      </w:pPr>
-      <w:r>
-        <w:t xml:space="preserve">prospective signal ingestion from digital safety tools;</w:t>
-      </w:r>
-    </w:p>
-    <w:p>
-      <w:pPr>
-        <w:pStyle w:val="Compact"/>
-        <w:numPr>
-          <w:ilvl w:val="0"/>
-          <w:numId w:val="1013"/>
-        </w:numPr>
-      </w:pPr>
-      <w:r>
-        <w:t xml:space="preserve">benchmark reporting;</w:t>
-      </w:r>
-    </w:p>
-    <w:p>
-      <w:pPr>
-        <w:pStyle w:val="Compact"/>
-        <w:numPr>
-          <w:ilvl w:val="0"/>
-          <w:numId w:val="1013"/>
-        </w:numPr>
-      </w:pPr>
-      <w:r>
-        <w:t xml:space="preserve">policy dashboards;</w:t>
-      </w:r>
-    </w:p>
-    <w:p>
-      <w:pPr>
-        <w:pStyle w:val="Compact"/>
-        <w:numPr>
-          <w:ilvl w:val="0"/>
-          <w:numId w:val="1013"/>
-        </w:numPr>
-      </w:pPr>
-      <w:r>
-        <w:t xml:space="preserve">research and publication outputs on burden, trends, and intervention effects.</w:t>
-      </w:r>
-    </w:p>
-    <w:bookmarkEnd w:id="33"/>
-    <w:bookmarkEnd w:id="34"/>
-    <w:bookmarkStart w:id="35" w:name="Xae77ca6f0f20b0f92c6dda1090cd2020583fb7a"/>
-    <w:p>
-      <w:pPr>
-        <w:pStyle w:val="Heading2"/>
-      </w:pPr>
-      <w:r>
-        <w:t xml:space="preserve">Strengths and limitations of the proposed framework</w:t>
-      </w:r>
-    </w:p>
-    <w:p>
-      <w:pPr>
-        <w:pStyle w:val="FirstParagraph"/>
-      </w:pPr>
-      <w:r>
-        <w:t xml:space="preserve">The main strength of this framework is that it integrates patient safety reporting, surveillance, learning, and governance rather than addressing them as separate programmes. It is also designed explicitly for Indian health-system realities, including mixed digital maturity and layered governance. Figure 1 summarizes the federated operating model, and Figure 2 depicts the data and learning flow across manual reporting, digital ingestion, analytics, and governance.</w:t>
-      </w:r>
-    </w:p>
-    <w:p>
-      <w:pPr>
-        <w:pStyle w:val="BodyText"/>
-      </w:pPr>
-      <w:r>
-        <w:t xml:space="preserve">The main limitation is that this paper is conceptual and review-based. It does not provide prospective implementation outcomes, burden estimates from multicentric deployment, or measured effect on harm reduction. Those will require phased piloting and evaluation using robust designs. The framework should therefore be interpreted as a systems blueprint for implementation and study, not as proof of effectiveness.</w:t>
-      </w:r>
-    </w:p>
-    <w:bookmarkEnd w:id="35"/>
-    <w:bookmarkStart w:id="36" w:name="conclusion"/>
-    <w:p>
-      <w:pPr>
-        <w:pStyle w:val="Heading2"/>
-      </w:pPr>
-      <w:r>
-        <w:t xml:space="preserve">Conclusion</w:t>
-      </w:r>
-    </w:p>
-    <w:p>
-      <w:pPr>
-        <w:pStyle w:val="FirstParagraph"/>
-      </w:pPr>
-      <w:r>
-        <w:t xml:space="preserve">India needs a patient safety surveillance system that does more than collect incident narratives. A scalable system must distinguish routine surveillance from event-level learning, use a common taxonomy, support facility-to-national review functions, preserve auditability, and be interoperable with the country’s evolving digital health architecture. AI may help with classification and summarization, but the system must remain human-governed and prevention-oriented. A federated patient safety surveillance model offers a realistic path for converting fragmented safety information into structured learning and safer health-system action in India.</w:t>
-      </w:r>
-    </w:p>
-    <w:bookmarkEnd w:id="36"/>
-    <w:bookmarkStart w:id="44" w:name="declarations"/>
-    <w:p>
-      <w:pPr>
-        <w:pStyle w:val="Heading2"/>
-      </w:pPr>
-      <w:r>
-        <w:t xml:space="preserve">Declarations</w:t>
-      </w:r>
-    </w:p>
-    <w:bookmarkStart w:id="37" w:name="Xad4c21cc653cc19fa281b7f2d37b6030518deb4"/>
-    <w:p>
-      <w:pPr>
-        <w:pStyle w:val="Heading3"/>
-      </w:pPr>
-      <w:r>
-        <w:t xml:space="preserve">Ethical approval and consent to participate</w:t>
-      </w:r>
-    </w:p>
-    <w:p>
-      <w:pPr>
-        <w:pStyle w:val="FirstParagraph"/>
-      </w:pPr>
-      <w:r>
-        <w:t xml:space="preserve">Not applicable. This manuscript is a structured narrative review and framework synthesis. No human participants were enrolled, and no primary patient-level dataset was collected or analyzed.</w:t>
-      </w:r>
-    </w:p>
-    <w:bookmarkEnd w:id="37"/>
-    <w:bookmarkStart w:id="38" w:name="consent-for-publication"/>
-    <w:p>
-      <w:pPr>
-        <w:pStyle w:val="Heading3"/>
-      </w:pPr>
-      <w:r>
-        <w:t xml:space="preserve">Consent for publication</w:t>
-      </w:r>
-    </w:p>
-    <w:p>
-      <w:pPr>
-        <w:pStyle w:val="FirstParagraph"/>
-      </w:pPr>
-      <w:r>
-        <w:t xml:space="preserve">Not applicable.</w:t>
-      </w:r>
-    </w:p>
-    <w:bookmarkEnd w:id="38"/>
-    <w:bookmarkStart w:id="39" w:name="availability-of-data-and-materials"/>
-    <w:p>
-      <w:pPr>
-        <w:pStyle w:val="Heading3"/>
-      </w:pPr>
-      <w:r>
-        <w:t xml:space="preserve">Availability of data and materials</w:t>
-      </w:r>
-    </w:p>
-    <w:p>
-      <w:pPr>
-        <w:pStyle w:val="FirstParagraph"/>
-      </w:pPr>
-      <w:r>
-        <w:t xml:space="preserve">No primary analytic dataset was generated for this manuscript. All cited policy documents, guidance sources, and published literature are publicly available through the referenced sources.</w:t>
-      </w:r>
-    </w:p>
-    <w:bookmarkEnd w:id="39"/>
-    <w:bookmarkStart w:id="40" w:name="funding"/>
-    <w:p>
-      <w:pPr>
-        <w:pStyle w:val="Heading3"/>
-      </w:pPr>
-      <w:r>
-        <w:t xml:space="preserve">Funding</w:t>
-      </w:r>
-    </w:p>
-    <w:p>
-      <w:pPr>
-        <w:pStyle w:val="FirstParagraph"/>
-      </w:pPr>
-      <w:r>
-        <w:t xml:space="preserve">No specific external funding was received for this work.</w:t>
-      </w:r>
-    </w:p>
-    <w:bookmarkEnd w:id="40"/>
-    <w:bookmarkStart w:id="41" w:name="conflicts-of-interest"/>
-    <w:p>
-      <w:pPr>
-        <w:pStyle w:val="Heading3"/>
-      </w:pPr>
-      <w:r>
-        <w:t xml:space="preserve">Conflicts of interest</w:t>
-      </w:r>
-    </w:p>
-    <w:p>
-      <w:pPr>
-        <w:pStyle w:val="FirstParagraph"/>
-      </w:pPr>
-      <w:r>
-        <w:t xml:space="preserve">The author is the originating conceptual lead for the SentinelCare and India Patient Safety Surveillance project frameworks described in this manuscript.</w:t>
-      </w:r>
-    </w:p>
-    <w:bookmarkEnd w:id="41"/>
-    <w:bookmarkStart w:id="42" w:name="author-contributions"/>
-    <w:p>
-      <w:pPr>
-        <w:pStyle w:val="Heading3"/>
-      </w:pPr>
-      <w:r>
-        <w:t xml:space="preserve">Author contributions</w:t>
-      </w:r>
-    </w:p>
-    <w:p>
-      <w:pPr>
-        <w:pStyle w:val="FirstParagraph"/>
-      </w:pPr>
-      <w:r>
-        <w:t xml:space="preserve">The sole author conceived the manuscript, conducted the literature and policy synthesis, developed the framework, and wrote and revised the manuscript.</w:t>
-      </w:r>
-    </w:p>
-    <w:bookmarkEnd w:id="42"/>
-    <w:bookmarkStart w:id="43" w:name="ai-use-disclosure"/>
-    <w:p>
-      <w:pPr>
-        <w:pStyle w:val="Heading3"/>
-      </w:pPr>
-      <w:r>
-        <w:t xml:space="preserve">AI use disclosure</w:t>
-      </w:r>
-    </w:p>
-    <w:p>
-      <w:pPr>
-        <w:pStyle w:val="FirstParagraph"/>
-      </w:pPr>
-      <w:r>
-        <w:t xml:space="preserve">AI-assisted tools were used for drafting support and language organization under direct author supervision. The author reviewed, corrected, and takes full responsibility for the final content.</w:t>
-      </w:r>
-    </w:p>
-    <w:bookmarkEnd w:id="43"/>
-    <w:bookmarkEnd w:id="44"/>
-    <w:bookmarkStart w:id="45" w:name="references"/>
-    <w:p>
-      <w:pPr>
-        <w:pStyle w:val="Heading2"/>
-      </w:pPr>
-      <w:r>
-        <w:t xml:space="preserve">References</w:t>
-      </w:r>
-    </w:p>
-    <w:p>
-      <w:pPr>
-        <w:pStyle w:val="Compact"/>
-        <w:numPr>
-          <w:ilvl w:val="0"/>
-          <w:numId w:val="1014"/>
-        </w:numPr>
-      </w:pPr>
-      <w:r>
-        <w:t xml:space="preserve">World Health Organization. Global patient safety action plan 2021-2030: towards eliminating avoidable harm in health care. Geneva: WHO; 2021.</w:t>
-      </w:r>
-    </w:p>
-    <w:p>
-      <w:pPr>
-        <w:pStyle w:val="Compact"/>
-        <w:numPr>
-          <w:ilvl w:val="0"/>
-          <w:numId w:val="1014"/>
-        </w:numPr>
-      </w:pPr>
-      <w:r>
-        <w:t xml:space="preserve">World Health Organization. Global patient safety report 2024. Geneva: WHO; 2024. Available from: https://iris.who.int/handle/10665/376928, accessed on March 8, 2026.</w:t>
-      </w:r>
-    </w:p>
-    <w:p>
-      <w:pPr>
-        <w:pStyle w:val="Compact"/>
-        <w:numPr>
-          <w:ilvl w:val="0"/>
-          <w:numId w:val="1014"/>
-        </w:numPr>
-      </w:pPr>
-      <w:r>
-        <w:t xml:space="preserve">National Health Authority. Ayushman Bharat Digital Mission resources. Available from: https://www.abdm.gov.in/resources, accessed on March 8, 2026.</w:t>
-      </w:r>
-    </w:p>
-    <w:p>
-      <w:pPr>
-        <w:pStyle w:val="Compact"/>
-        <w:numPr>
-          <w:ilvl w:val="0"/>
-          <w:numId w:val="1014"/>
-        </w:numPr>
-      </w:pPr>
-      <w:r>
-        <w:t xml:space="preserve">National Health Authority. About Ayushman Bharat Digital Mission. Available from: https://nha.gov.in/NDHM, accessed on March 8, 2026.</w:t>
-      </w:r>
-    </w:p>
-    <w:p>
-      <w:pPr>
-        <w:pStyle w:val="Compact"/>
-        <w:numPr>
-          <w:ilvl w:val="0"/>
-          <w:numId w:val="1014"/>
-        </w:numPr>
-      </w:pPr>
-      <w:r>
-        <w:t xml:space="preserve">Ministry of Health and Family Welfare, Government of India. Integrated Health Information Platform. Available from: https://ihip.mohfw.gov.in/, accessed on March 8, 2026.</w:t>
-      </w:r>
-    </w:p>
-    <w:p>
-      <w:pPr>
-        <w:pStyle w:val="Compact"/>
-        <w:numPr>
-          <w:ilvl w:val="0"/>
-          <w:numId w:val="1014"/>
-        </w:numPr>
-      </w:pPr>
-      <w:r>
-        <w:t xml:space="preserve">Health Quality Ontario. Patient safety learning systems: a systematic review and qualitative synthesis. Ont Health Technol Assess Ser 2017;17:1-23. Available from: https://pmc.ncbi.nlm.nih.gov/articles/PMC5357133/, accessed on March 8, 2026.</w:t>
-      </w:r>
-    </w:p>
-    <w:p>
-      <w:pPr>
-        <w:pStyle w:val="Compact"/>
-        <w:numPr>
-          <w:ilvl w:val="0"/>
-          <w:numId w:val="1014"/>
-        </w:numPr>
-      </w:pPr>
-      <w:r>
-        <w:t xml:space="preserve">Kuitunen I, Ponkilainen V, Hallila H, Nuutinen M, Alanen V, Reponiemi T, et al. Patient safety incident reporting and learning guidelines implemented by health care professionals in specialized care units: scoping review. J Med Internet Res 2024;26:e55971. Available from: https://pmc.ncbi.nlm.nih.gov/articles/PMC11489802/, accessed on March 8, 2026.</w:t>
-      </w:r>
-    </w:p>
-    <w:p>
-      <w:pPr>
-        <w:pStyle w:val="Compact"/>
-        <w:numPr>
-          <w:ilvl w:val="0"/>
-          <w:numId w:val="1014"/>
-        </w:numPr>
-      </w:pPr>
-      <w:r>
-        <w:t xml:space="preserve">National Accreditation Board for Hospitals and Healthcare Providers. NABH standards. Available from: https://nabh.co/nabh-standards/, accessed on March 8, 2026.</w:t>
-      </w:r>
-    </w:p>
-    <w:p>
-      <w:pPr>
-        <w:pStyle w:val="Compact"/>
-        <w:numPr>
-          <w:ilvl w:val="0"/>
-          <w:numId w:val="1014"/>
-        </w:numPr>
-      </w:pPr>
-      <w:r>
-        <w:t xml:space="preserve">World Health Organization. Ethics and governance of artificial intelligence for health. Geneva: WHO; 2021.</w:t>
-      </w:r>
-    </w:p>
-    <w:p>
-      <w:pPr>
-        <w:pStyle w:val="Compact"/>
-        <w:numPr>
-          <w:ilvl w:val="0"/>
-          <w:numId w:val="1014"/>
-        </w:numPr>
-      </w:pPr>
-      <w:r>
-        <w:t xml:space="preserve">International Committee of Medical Journal Editors. Recommendations for the conduct, reporting, editing, and publication of scholarly work in medical journals. Available from: https://www.icmje.org/, accessed on March 8, 2026.</w:t>
-      </w:r>
-    </w:p>
-    <w:p>
-      <w:pPr>
-        <w:pStyle w:val="Compact"/>
-        <w:numPr>
-          <w:ilvl w:val="0"/>
-          <w:numId w:val="1014"/>
-        </w:numPr>
-      </w:pPr>
-      <w:r>
-        <w:t xml:space="preserve">EQUATOR Network. Enhancing the quality and transparency of health research. Available from: https://www.equator-network.org/, accessed on March 8, 2026.</w:t>
-      </w:r>
-    </w:p>
-    <w:p>
-      <w:pPr>
-        <w:pStyle w:val="Compact"/>
-        <w:numPr>
-          <w:ilvl w:val="0"/>
-          <w:numId w:val="1014"/>
-        </w:numPr>
-      </w:pPr>
-      <w:r>
-        <w:t xml:space="preserve">Indian Council of Medical Research. National ethical guidelines for biomedical and health research involving human participants. New Delhi: ICMR; 2017. Available from: https://www.icmr.gov.in/icmrobject/custom_data/pdf/resource-guidelines/ICMR_Ethical_Guidelines_2017.pdf, accessed on March 8, 2026.</w:t>
-      </w:r>
-    </w:p>
-    <w:p>
-      <w:pPr>
-        <w:pStyle w:val="Compact"/>
-        <w:numPr>
-          <w:ilvl w:val="0"/>
-          <w:numId w:val="1014"/>
-        </w:numPr>
-      </w:pPr>
-      <w:r>
-        <w:t xml:space="preserve">World Health Organization. Progress on patient safety across health systems around the world. Available from: https://www.who.int/news/item/23-05-2025-progress-on-patient-safety-across-health-systems-around-the-world, accessed on March 8, 2026.</w:t>
-      </w:r>
-    </w:p>
-    <w:p>
-      <w:pPr>
-        <w:pStyle w:val="Compact"/>
-        <w:numPr>
-          <w:ilvl w:val="0"/>
-          <w:numId w:val="1014"/>
-        </w:numPr>
-      </w:pPr>
-      <w:r>
-        <w:t xml:space="preserve">Garg S, Gangadharan N, Bhatnagar N, Singh MM, Raina SK, Galwankar S. The Ayushman Bharat Digital Mission of India: an assessment. J Med Syst 2024;48:123.</w:t>
-      </w:r>
-    </w:p>
-    <w:p>
-      <w:pPr>
-        <w:pStyle w:val="Compact"/>
-        <w:numPr>
-          <w:ilvl w:val="0"/>
-          <w:numId w:val="1014"/>
-        </w:numPr>
-      </w:pPr>
-      <w:r>
-        <w:t xml:space="preserve">Leape LL. Reporting of adverse events. N Engl J Med 2002;347:1633-8.</w:t>
-      </w:r>
-    </w:p>
-    <w:p>
-      <w:pPr>
-        <w:pStyle w:val="Compact"/>
-        <w:numPr>
-          <w:ilvl w:val="0"/>
-          <w:numId w:val="1014"/>
-        </w:numPr>
-      </w:pPr>
-      <w:r>
-        <w:t xml:space="preserve">Barach P, Small SD. Reporting and preventing medical mishaps: lessons from non-medical near miss reporting systems. BMJ 2000;320:759-63.</w:t>
-      </w:r>
-    </w:p>
-    <w:p>
-      <w:pPr>
-        <w:pStyle w:val="Compact"/>
-        <w:numPr>
-          <w:ilvl w:val="0"/>
-          <w:numId w:val="1014"/>
-        </w:numPr>
-      </w:pPr>
-      <w:r>
-        <w:t xml:space="preserve">Pham JC, Girard T, Pronovost PJ. What to do with healthcare incident reporting systems. J Public Health Res 2013;2:e27.</w:t>
-      </w:r>
-    </w:p>
-    <w:p>
-      <w:pPr>
-        <w:pStyle w:val="Compact"/>
-        <w:numPr>
-          <w:ilvl w:val="0"/>
-          <w:numId w:val="1014"/>
-        </w:numPr>
-      </w:pPr>
-      <w:r>
-        <w:t xml:space="preserve">Stavropoulou C, Doherty C, Tosey P. How effective are incident-reporting systems for improving patient safety? A systematic literature review. Milbank Q 2015;93:826-66.</w:t>
-      </w:r>
-    </w:p>
-    <w:p>
-      <w:pPr>
-        <w:pStyle w:val="Compact"/>
-        <w:numPr>
-          <w:ilvl w:val="0"/>
-          <w:numId w:val="1014"/>
-        </w:numPr>
-      </w:pPr>
-      <w:r>
-        <w:t xml:space="preserve">Mitchell I, Schuster A, Smith K, Pronovost P, Wu A. Patient safety incident reporting: a qualitative study of thoughts and perceptions of experts 15 years after</w:t>
-      </w:r>
-      <w:r>
-        <w:t xml:space="preserve"> </w:t>
-      </w:r>
-      <w:r>
-        <w:t xml:space="preserve">‘To Err Is Human’</w:t>
-      </w:r>
-      <w:r>
-        <w:t xml:space="preserve">. BMJ Qual Saf 2016;25:92-9.</w:t>
-      </w:r>
-    </w:p>
-    <w:p>
-      <w:pPr>
-        <w:pStyle w:val="Compact"/>
-        <w:numPr>
-          <w:ilvl w:val="0"/>
-          <w:numId w:val="1014"/>
-        </w:numPr>
-      </w:pPr>
-      <w:r>
-        <w:t xml:space="preserve">Agency for Healthcare Research and Quality. Patient safety organizations and learning systems. Available from: https://www.ahrq.gov/patient-safety/reporting.html, accessed on March 8, 2026.</w:t>
-      </w:r>
-    </w:p>
-    <w:p>
-      <w:pPr>
-        <w:pStyle w:val="Compact"/>
-        <w:numPr>
-          <w:ilvl w:val="0"/>
-          <w:numId w:val="1014"/>
-        </w:numPr>
-      </w:pPr>
-      <w:r>
-        <w:t xml:space="preserve">Bates DW, Singh H. Two decades since To Err Is Human: an assessment of progress and emerging priorities in patient safety. Health Aff 2018;37:1736-43.</w:t>
-      </w:r>
-    </w:p>
-    <w:p>
-      <w:pPr>
-        <w:pStyle w:val="Compact"/>
-        <w:numPr>
-          <w:ilvl w:val="0"/>
-          <w:numId w:val="1014"/>
-        </w:numPr>
-      </w:pPr>
-      <w:r>
-        <w:t xml:space="preserve">Singh H, Sittig DF. Advancing the science of measurement of diagnostic errors in healthcare. BMJ Qual Saf 2015;24:103-10.</w:t>
-      </w:r>
-    </w:p>
-    <w:p>
-      <w:pPr>
-        <w:pStyle w:val="Compact"/>
-        <w:numPr>
-          <w:ilvl w:val="0"/>
-          <w:numId w:val="1014"/>
-        </w:numPr>
-      </w:pPr>
-      <w:r>
-        <w:t xml:space="preserve">World Health Organization. World patient safety day 2024 campaign materials. Available from: https://www.who.int/campaigns/world-patient-safety-day/2024, accessed on March 8, 2026.</w:t>
-      </w:r>
-    </w:p>
-    <w:p>
-      <w:pPr>
-        <w:pStyle w:val="Compact"/>
-        <w:numPr>
-          <w:ilvl w:val="0"/>
-          <w:numId w:val="1014"/>
-        </w:numPr>
-      </w:pPr>
-      <w:r>
-        <w:t xml:space="preserve">World Bank. India - transforming India’s public health surveillance through digital systems. Available from: https://documents1.worldbank.org/curated/en/099145106042242190/pdf/P175676001543d000b7c709870c0c3375b.pdf, accessed on March 8, 2026.</w:t>
-      </w:r>
-    </w:p>
-    <w:p>
-      <w:pPr>
-        <w:pStyle w:val="Compact"/>
-        <w:numPr>
-          <w:ilvl w:val="0"/>
-          <w:numId w:val="1014"/>
-        </w:numPr>
-      </w:pPr>
-      <w:r>
-        <w:t xml:space="preserve">Flemons WW, McRae G. Reporting, learning and the culture of safety. Healthc Q 2012;15 Spec No:12-7.</w:t>
-      </w:r>
-    </w:p>
-    <w:bookmarkEnd w:id="45"/>
-    <w:bookmarkEnd w:id="46"/>
+        <w:t xml:space="preserve">Figures</w:t>
+      </w:r>
+    </w:p>
+    <w:p>
+      <w:pPr>
+        <w:pStyle w:val="FirstParagraph"/>
+      </w:pPr>
+      <w:r>
+        <w:t xml:space="preserve">Figure 1 and Figure 2 are provided in the separate figures document and source image files for production-quality handling.</w:t>
+      </w:r>
+    </w:p>
+    <w:bookmarkEnd w:id="49"/>
+    <w:bookmarkEnd w:id="50"/>
     <w:sectPr>
       <w:footnotePr>
         <w:numRestart w:val="eachSect"/>

</xml_diff>